<commit_message>
[09:54 (W.I.B (Waktu Indonesia bagian Barat)), 09/06/2026], Batam, Kepulauan Riau, Indonesia
[09:54 (W.I.B (Waktu Indonesia bagian Barat)), 09/06/2026], Batam, Kepulauan Riau, Indonesia
</commit_message>
<xml_diff>
--- a/Bear Scout versus Tiger Mom.docx
+++ b/Bear Scout versus Tiger Mom.docx
@@ -1952,14 +1952,7 @@
           <w:rFonts w:ascii="Times New Roman" w:hAnsi="Times New Roman" w:cs="Times New Roman"/>
           <w:lang w:val="id-ID"/>
         </w:rPr>
-        <w:t>!.</w:t>
-      </w:r>
-      <w:r>
-        <w:rPr>
-          <w:rFonts w:ascii="Times New Roman" w:hAnsi="Times New Roman" w:cs="Times New Roman"/>
-          <w:lang w:val="id-ID"/>
-        </w:rPr>
-        <w:t xml:space="preserve">”, tiba – tiba terdengar teriakan tak Marcel tahu maksud </w:t>
+        <w:t xml:space="preserve">!.”, tiba – tiba terdengar teriakan tak Marcel tahu maksud </w:t>
       </w:r>
       <w:proofErr w:type="spellStart"/>
       <w:r>
@@ -2802,6 +2795,2767 @@
           <w:lang w:val="id-ID"/>
         </w:rPr>
         <w:t>gale</w:t>
+      </w:r>
+      <w:proofErr w:type="spellEnd"/>
+      <w:r>
+        <w:rPr>
+          <w:rFonts w:ascii="Times New Roman" w:hAnsi="Times New Roman" w:cs="Times New Roman"/>
+          <w:lang w:val="id-ID"/>
+        </w:rPr>
+        <w:t xml:space="preserve">” : Memainkan seruling dan membuat tidur orang yang mendengar </w:t>
+      </w:r>
+      <w:proofErr w:type="spellStart"/>
+      <w:r>
+        <w:rPr>
+          <w:rFonts w:ascii="Times New Roman" w:hAnsi="Times New Roman" w:cs="Times New Roman"/>
+          <w:lang w:val="id-ID"/>
+        </w:rPr>
+        <w:t>nya</w:t>
+      </w:r>
+      <w:proofErr w:type="spellEnd"/>
+      <w:r>
+        <w:rPr>
+          <w:rFonts w:ascii="Times New Roman" w:hAnsi="Times New Roman" w:cs="Times New Roman"/>
+          <w:lang w:val="id-ID"/>
+        </w:rPr>
+        <w:t>.</w:t>
+      </w:r>
+    </w:p>
+    <w:p>
+      <w:pPr>
+        <w:spacing w:line="360" w:lineRule="auto"/>
+        <w:ind w:left="720"/>
+        <w:rPr>
+          <w:rFonts w:ascii="Times New Roman" w:hAnsi="Times New Roman" w:cs="Times New Roman"/>
+          <w:lang w:val="id-ID"/>
+        </w:rPr>
+      </w:pPr>
+      <w:r>
+        <w:rPr>
+          <w:rFonts w:ascii="Times New Roman" w:hAnsi="Times New Roman" w:cs="Times New Roman"/>
+          <w:lang w:val="id-ID"/>
+        </w:rPr>
+        <w:t>Level 7 “Barbarian Shop” : Setiap barang yang dibeli dari Debat, membuat orang tersebut menjadi mabuk Agama.</w:t>
+      </w:r>
+    </w:p>
+    <w:p>
+      <w:pPr>
+        <w:spacing w:line="360" w:lineRule="auto"/>
+        <w:rPr>
+          <w:rFonts w:ascii="Times New Roman" w:hAnsi="Times New Roman" w:cs="Times New Roman"/>
+          <w:lang w:val="id-ID"/>
+        </w:rPr>
+      </w:pPr>
+    </w:p>
+    <w:p>
+      <w:pPr>
+        <w:spacing w:line="360" w:lineRule="auto"/>
+        <w:jc w:val="center"/>
+        <w:rPr>
+          <w:rFonts w:ascii="Times New Roman" w:hAnsi="Times New Roman" w:cs="Times New Roman"/>
+          <w:lang w:val="id-ID"/>
+        </w:rPr>
+      </w:pPr>
+      <w:r>
+        <w:rPr>
+          <w:rFonts w:ascii="Times New Roman" w:hAnsi="Times New Roman" w:cs="Times New Roman"/>
+          <w:lang w:val="id-ID"/>
+        </w:rPr>
+        <w:t xml:space="preserve">Episode </w:t>
+      </w:r>
+      <w:r>
+        <w:rPr>
+          <w:rFonts w:ascii="Times New Roman" w:hAnsi="Times New Roman" w:cs="Times New Roman"/>
+          <w:lang w:val="id-ID"/>
+        </w:rPr>
+        <w:t>3</w:t>
+      </w:r>
+      <w:r>
+        <w:rPr>
+          <w:rFonts w:ascii="Times New Roman" w:hAnsi="Times New Roman" w:cs="Times New Roman"/>
+          <w:lang w:val="id-ID"/>
+        </w:rPr>
+        <w:t xml:space="preserve"> :</w:t>
+      </w:r>
+    </w:p>
+    <w:p>
+      <w:pPr>
+        <w:spacing w:line="360" w:lineRule="auto"/>
+        <w:jc w:val="center"/>
+        <w:rPr>
+          <w:rFonts w:ascii="Times New Roman" w:hAnsi="Times New Roman" w:cs="Times New Roman"/>
+          <w:lang w:val="id-ID"/>
+        </w:rPr>
+      </w:pPr>
+      <w:proofErr w:type="spellStart"/>
+      <w:r>
+        <w:rPr>
+          <w:rFonts w:ascii="Times New Roman" w:hAnsi="Times New Roman" w:cs="Times New Roman"/>
+          <w:lang w:val="id-ID"/>
+        </w:rPr>
+        <w:t>De</w:t>
+      </w:r>
+      <w:r>
+        <w:rPr>
+          <w:rFonts w:ascii="Times New Roman" w:hAnsi="Times New Roman" w:cs="Times New Roman"/>
+          <w:lang w:val="id-ID"/>
+        </w:rPr>
+        <w:t>bes’s</w:t>
+      </w:r>
+      <w:proofErr w:type="spellEnd"/>
+      <w:r>
+        <w:rPr>
+          <w:rFonts w:ascii="Times New Roman" w:hAnsi="Times New Roman" w:cs="Times New Roman"/>
+          <w:lang w:val="id-ID"/>
+        </w:rPr>
+        <w:t xml:space="preserve"> The Best </w:t>
+      </w:r>
+      <w:proofErr w:type="spellStart"/>
+      <w:r>
+        <w:rPr>
+          <w:rFonts w:ascii="Times New Roman" w:hAnsi="Times New Roman" w:cs="Times New Roman"/>
+          <w:lang w:val="id-ID"/>
+        </w:rPr>
+        <w:t>Gamble</w:t>
+      </w:r>
+      <w:proofErr w:type="spellEnd"/>
+    </w:p>
+    <w:p>
+      <w:pPr>
+        <w:spacing w:line="360" w:lineRule="auto"/>
+        <w:jc w:val="center"/>
+        <w:rPr>
+          <w:rFonts w:ascii="Times New Roman" w:hAnsi="Times New Roman" w:cs="Times New Roman"/>
+          <w:lang w:val="id-ID"/>
+        </w:rPr>
+      </w:pPr>
+      <w:r>
+        <w:rPr>
+          <w:rFonts w:ascii="Times New Roman" w:hAnsi="Times New Roman" w:cs="Times New Roman"/>
+          <w:lang w:val="id-ID"/>
+        </w:rPr>
+        <w:t xml:space="preserve">“ </w:t>
+      </w:r>
+      <w:r>
+        <w:rPr>
+          <w:rFonts w:ascii="Times New Roman" w:hAnsi="Times New Roman" w:cs="Times New Roman"/>
+        </w:rPr>
+        <w:t>Love of money is root of evil</w:t>
+      </w:r>
+      <w:r>
+        <w:rPr>
+          <w:rFonts w:ascii="Times New Roman" w:hAnsi="Times New Roman" w:cs="Times New Roman"/>
+        </w:rPr>
+        <w:t xml:space="preserve"> </w:t>
+      </w:r>
+      <w:r>
+        <w:rPr>
+          <w:rFonts w:ascii="Times New Roman" w:hAnsi="Times New Roman" w:cs="Times New Roman"/>
+          <w:lang w:val="id-ID"/>
+        </w:rPr>
+        <w:t>”</w:t>
+      </w:r>
+    </w:p>
+    <w:p>
+      <w:pPr>
+        <w:spacing w:line="360" w:lineRule="auto"/>
+        <w:rPr>
+          <w:rFonts w:ascii="Times New Roman" w:hAnsi="Times New Roman" w:cs="Times New Roman"/>
+          <w:lang w:val="id-ID"/>
+        </w:rPr>
+      </w:pPr>
+    </w:p>
+    <w:p>
+      <w:pPr>
+        <w:spacing w:line="360" w:lineRule="auto"/>
+        <w:ind w:firstLine="720"/>
+        <w:rPr>
+          <w:rFonts w:ascii="Times New Roman" w:hAnsi="Times New Roman" w:cs="Times New Roman"/>
+          <w:lang w:val="id-ID"/>
+        </w:rPr>
+      </w:pPr>
+      <w:r>
+        <w:rPr>
+          <w:rFonts w:ascii="Times New Roman" w:hAnsi="Times New Roman" w:cs="Times New Roman"/>
+          <w:lang w:val="id-ID"/>
+        </w:rPr>
+        <w:t xml:space="preserve">Kerajaan Inggris gelisah pada waktu itu, karena Debat tidak juga Berhasil mengejar Marcel. </w:t>
+      </w:r>
+      <w:proofErr w:type="spellStart"/>
+      <w:r>
+        <w:rPr>
+          <w:rFonts w:ascii="Times New Roman" w:hAnsi="Times New Roman" w:cs="Times New Roman"/>
+          <w:lang w:val="id-ID"/>
+        </w:rPr>
+        <w:t>Debes</w:t>
+      </w:r>
+      <w:proofErr w:type="spellEnd"/>
+      <w:r>
+        <w:rPr>
+          <w:rFonts w:ascii="Times New Roman" w:hAnsi="Times New Roman" w:cs="Times New Roman"/>
+          <w:lang w:val="id-ID"/>
+        </w:rPr>
+        <w:t xml:space="preserve"> takut Debat mengalami kecelakaan di jalan, karena Debat waktu itu sedang sakit keras, dan sakit </w:t>
+      </w:r>
+      <w:proofErr w:type="spellStart"/>
+      <w:r>
+        <w:rPr>
+          <w:rFonts w:ascii="Times New Roman" w:hAnsi="Times New Roman" w:cs="Times New Roman"/>
+          <w:lang w:val="id-ID"/>
+        </w:rPr>
+        <w:t>nya</w:t>
+      </w:r>
+      <w:proofErr w:type="spellEnd"/>
+      <w:r>
+        <w:rPr>
+          <w:rFonts w:ascii="Times New Roman" w:hAnsi="Times New Roman" w:cs="Times New Roman"/>
+          <w:lang w:val="id-ID"/>
+        </w:rPr>
+        <w:t xml:space="preserve"> tidak diketahui oleh Raja Inggris pada waktu itu. Raja Inggris marah besar kepada </w:t>
+      </w:r>
+      <w:proofErr w:type="spellStart"/>
+      <w:r>
+        <w:rPr>
+          <w:rFonts w:ascii="Times New Roman" w:hAnsi="Times New Roman" w:cs="Times New Roman"/>
+          <w:lang w:val="id-ID"/>
+        </w:rPr>
+        <w:t>Debes</w:t>
+      </w:r>
+      <w:proofErr w:type="spellEnd"/>
+      <w:r>
+        <w:rPr>
+          <w:rFonts w:ascii="Times New Roman" w:hAnsi="Times New Roman" w:cs="Times New Roman"/>
+          <w:lang w:val="id-ID"/>
+        </w:rPr>
+        <w:t xml:space="preserve"> dan Debut, karena Marcel </w:t>
+      </w:r>
+      <w:r>
+        <w:rPr>
+          <w:rFonts w:ascii="Times New Roman" w:hAnsi="Times New Roman" w:cs="Times New Roman"/>
+          <w:lang w:val="id-ID"/>
+        </w:rPr>
+        <w:lastRenderedPageBreak/>
+        <w:t xml:space="preserve">dan Keluarga Wales tidak juga diberantas. Raja Inggris mengancam akan mengeluarkan </w:t>
+      </w:r>
+      <w:proofErr w:type="spellStart"/>
+      <w:r>
+        <w:rPr>
+          <w:rFonts w:ascii="Times New Roman" w:hAnsi="Times New Roman" w:cs="Times New Roman"/>
+          <w:lang w:val="id-ID"/>
+        </w:rPr>
+        <w:t>Cerberus</w:t>
+      </w:r>
+      <w:proofErr w:type="spellEnd"/>
+      <w:r>
+        <w:rPr>
+          <w:rFonts w:ascii="Times New Roman" w:hAnsi="Times New Roman" w:cs="Times New Roman"/>
+          <w:lang w:val="id-ID"/>
+        </w:rPr>
+        <w:t xml:space="preserve"> pada Waktu itu untuk membinasakan </w:t>
+      </w:r>
+      <w:proofErr w:type="spellStart"/>
+      <w:r>
+        <w:rPr>
+          <w:rFonts w:ascii="Times New Roman" w:hAnsi="Times New Roman" w:cs="Times New Roman"/>
+          <w:lang w:val="id-ID"/>
+        </w:rPr>
+        <w:t>Debes</w:t>
+      </w:r>
+      <w:proofErr w:type="spellEnd"/>
+      <w:r>
+        <w:rPr>
+          <w:rFonts w:ascii="Times New Roman" w:hAnsi="Times New Roman" w:cs="Times New Roman"/>
+          <w:lang w:val="id-ID"/>
+        </w:rPr>
+        <w:t xml:space="preserve"> dan Debut. </w:t>
+      </w:r>
+      <w:proofErr w:type="spellStart"/>
+      <w:r>
+        <w:rPr>
+          <w:rFonts w:ascii="Times New Roman" w:hAnsi="Times New Roman" w:cs="Times New Roman"/>
+          <w:lang w:val="id-ID"/>
+        </w:rPr>
+        <w:t>Debes</w:t>
+      </w:r>
+      <w:proofErr w:type="spellEnd"/>
+      <w:r>
+        <w:rPr>
+          <w:rFonts w:ascii="Times New Roman" w:hAnsi="Times New Roman" w:cs="Times New Roman"/>
+          <w:lang w:val="id-ID"/>
+        </w:rPr>
+        <w:t xml:space="preserve"> dan Debut sangat takut dengan </w:t>
+      </w:r>
+      <w:proofErr w:type="spellStart"/>
+      <w:r>
+        <w:rPr>
+          <w:rFonts w:ascii="Times New Roman" w:hAnsi="Times New Roman" w:cs="Times New Roman"/>
+          <w:lang w:val="id-ID"/>
+        </w:rPr>
+        <w:t>Cerberus</w:t>
+      </w:r>
+      <w:proofErr w:type="spellEnd"/>
+      <w:r>
+        <w:rPr>
+          <w:rFonts w:ascii="Times New Roman" w:hAnsi="Times New Roman" w:cs="Times New Roman"/>
+          <w:lang w:val="id-ID"/>
+        </w:rPr>
+        <w:t xml:space="preserve">, karena </w:t>
+      </w:r>
+      <w:proofErr w:type="spellStart"/>
+      <w:r>
+        <w:rPr>
+          <w:rFonts w:ascii="Times New Roman" w:hAnsi="Times New Roman" w:cs="Times New Roman"/>
+          <w:lang w:val="id-ID"/>
+        </w:rPr>
+        <w:t>Cerberus</w:t>
+      </w:r>
+      <w:proofErr w:type="spellEnd"/>
+      <w:r>
+        <w:rPr>
+          <w:rFonts w:ascii="Times New Roman" w:hAnsi="Times New Roman" w:cs="Times New Roman"/>
+          <w:lang w:val="id-ID"/>
+        </w:rPr>
+        <w:t xml:space="preserve"> adalah Makhluk yang semakin dibunuh semakin membelah diri. </w:t>
+      </w:r>
+      <w:proofErr w:type="spellStart"/>
+      <w:r>
+        <w:rPr>
+          <w:rFonts w:ascii="Times New Roman" w:hAnsi="Times New Roman" w:cs="Times New Roman"/>
+          <w:lang w:val="id-ID"/>
+        </w:rPr>
+        <w:t>Cerberus</w:t>
+      </w:r>
+      <w:proofErr w:type="spellEnd"/>
+      <w:r>
+        <w:rPr>
+          <w:rFonts w:ascii="Times New Roman" w:hAnsi="Times New Roman" w:cs="Times New Roman"/>
+          <w:lang w:val="id-ID"/>
+        </w:rPr>
+        <w:t xml:space="preserve"> setara dengan 8 Anggota </w:t>
+      </w:r>
+      <w:proofErr w:type="spellStart"/>
+      <w:r>
+        <w:rPr>
+          <w:rFonts w:ascii="Times New Roman" w:hAnsi="Times New Roman" w:cs="Times New Roman"/>
+          <w:i/>
+          <w:iCs/>
+          <w:lang w:val="id-ID"/>
+        </w:rPr>
+        <w:t>Bear</w:t>
+      </w:r>
+      <w:proofErr w:type="spellEnd"/>
+      <w:r>
+        <w:rPr>
+          <w:rFonts w:ascii="Times New Roman" w:hAnsi="Times New Roman" w:cs="Times New Roman"/>
+          <w:i/>
+          <w:iCs/>
+          <w:lang w:val="id-ID"/>
+        </w:rPr>
+        <w:t xml:space="preserve"> </w:t>
+      </w:r>
+      <w:proofErr w:type="spellStart"/>
+      <w:r>
+        <w:rPr>
+          <w:rFonts w:ascii="Times New Roman" w:hAnsi="Times New Roman" w:cs="Times New Roman"/>
+          <w:i/>
+          <w:iCs/>
+          <w:lang w:val="id-ID"/>
+        </w:rPr>
+        <w:t>Scout</w:t>
+      </w:r>
+      <w:proofErr w:type="spellEnd"/>
+      <w:r>
+        <w:rPr>
+          <w:rFonts w:ascii="Times New Roman" w:hAnsi="Times New Roman" w:cs="Times New Roman"/>
+          <w:lang w:val="id-ID"/>
+        </w:rPr>
+        <w:t xml:space="preserve">. Oleh karena itu, </w:t>
+      </w:r>
+      <w:proofErr w:type="spellStart"/>
+      <w:r>
+        <w:rPr>
+          <w:rFonts w:ascii="Times New Roman" w:hAnsi="Times New Roman" w:cs="Times New Roman"/>
+          <w:lang w:val="id-ID"/>
+        </w:rPr>
+        <w:t>Debes</w:t>
+      </w:r>
+      <w:proofErr w:type="spellEnd"/>
+      <w:r>
+        <w:rPr>
+          <w:rFonts w:ascii="Times New Roman" w:hAnsi="Times New Roman" w:cs="Times New Roman"/>
+          <w:lang w:val="id-ID"/>
+        </w:rPr>
+        <w:t xml:space="preserve"> dan Debut meminta pengampunan dari Raja Inggris dan Berjanji akan membawa Marcel </w:t>
+      </w:r>
+      <w:proofErr w:type="spellStart"/>
+      <w:r>
+        <w:rPr>
+          <w:rFonts w:ascii="Times New Roman" w:hAnsi="Times New Roman" w:cs="Times New Roman"/>
+          <w:lang w:val="id-ID"/>
+        </w:rPr>
+        <w:t>kehadapan</w:t>
+      </w:r>
+      <w:proofErr w:type="spellEnd"/>
+      <w:r>
+        <w:rPr>
+          <w:rFonts w:ascii="Times New Roman" w:hAnsi="Times New Roman" w:cs="Times New Roman"/>
+          <w:lang w:val="id-ID"/>
+        </w:rPr>
+        <w:t xml:space="preserve"> Raja Inggris sebelum matahari terbenam. </w:t>
+      </w:r>
+      <w:proofErr w:type="spellStart"/>
+      <w:r>
+        <w:rPr>
+          <w:rFonts w:ascii="Times New Roman" w:hAnsi="Times New Roman" w:cs="Times New Roman"/>
+          <w:lang w:val="id-ID"/>
+        </w:rPr>
+        <w:t>Debes</w:t>
+      </w:r>
+      <w:proofErr w:type="spellEnd"/>
+      <w:r>
+        <w:rPr>
+          <w:rFonts w:ascii="Times New Roman" w:hAnsi="Times New Roman" w:cs="Times New Roman"/>
+          <w:lang w:val="id-ID"/>
+        </w:rPr>
+        <w:t xml:space="preserve"> lebih dulu menyusul Debat, Debut menyusul tanpa sepengetahuan Debut</w:t>
+      </w:r>
+      <w:r>
+        <w:rPr>
+          <w:rFonts w:ascii="Times New Roman" w:hAnsi="Times New Roman" w:cs="Times New Roman"/>
+          <w:lang w:val="id-ID"/>
+        </w:rPr>
+        <w:t xml:space="preserve">, Debut heran Cepat sekali </w:t>
+      </w:r>
+      <w:proofErr w:type="spellStart"/>
+      <w:r>
+        <w:rPr>
+          <w:rFonts w:ascii="Times New Roman" w:hAnsi="Times New Roman" w:cs="Times New Roman"/>
+          <w:lang w:val="id-ID"/>
+        </w:rPr>
+        <w:t>Debes</w:t>
+      </w:r>
+      <w:proofErr w:type="spellEnd"/>
+      <w:r>
+        <w:rPr>
+          <w:rFonts w:ascii="Times New Roman" w:hAnsi="Times New Roman" w:cs="Times New Roman"/>
+          <w:lang w:val="id-ID"/>
+        </w:rPr>
+        <w:t xml:space="preserve"> pergi. </w:t>
+      </w:r>
+      <w:proofErr w:type="spellStart"/>
+      <w:r>
+        <w:rPr>
+          <w:rFonts w:ascii="Times New Roman" w:hAnsi="Times New Roman" w:cs="Times New Roman"/>
+          <w:lang w:val="id-ID"/>
+        </w:rPr>
+        <w:t>Debes</w:t>
+      </w:r>
+      <w:proofErr w:type="spellEnd"/>
+      <w:r>
+        <w:rPr>
+          <w:rFonts w:ascii="Times New Roman" w:hAnsi="Times New Roman" w:cs="Times New Roman"/>
+          <w:lang w:val="id-ID"/>
+        </w:rPr>
+        <w:t xml:space="preserve"> berharap ini semua cepat selesai.</w:t>
+      </w:r>
+    </w:p>
+    <w:p>
+      <w:pPr>
+        <w:spacing w:line="360" w:lineRule="auto"/>
+        <w:ind w:firstLine="720"/>
+        <w:rPr>
+          <w:rFonts w:ascii="Times New Roman" w:hAnsi="Times New Roman" w:cs="Times New Roman"/>
+          <w:lang w:val="id-ID"/>
+        </w:rPr>
+      </w:pPr>
+      <w:r>
+        <w:rPr>
+          <w:rFonts w:ascii="Times New Roman" w:hAnsi="Times New Roman" w:cs="Times New Roman"/>
+          <w:lang w:val="id-ID"/>
+        </w:rPr>
+        <w:t xml:space="preserve">Marcel berdoa pada Tuhan Yesus Kristus (Marcel adalah seorang Kristen), supaya bisa kembali ke rumah </w:t>
+      </w:r>
+      <w:proofErr w:type="spellStart"/>
+      <w:r>
+        <w:rPr>
+          <w:rFonts w:ascii="Times New Roman" w:hAnsi="Times New Roman" w:cs="Times New Roman"/>
+          <w:lang w:val="id-ID"/>
+        </w:rPr>
+        <w:t>nya</w:t>
+      </w:r>
+      <w:proofErr w:type="spellEnd"/>
+      <w:r>
+        <w:rPr>
+          <w:rFonts w:ascii="Times New Roman" w:hAnsi="Times New Roman" w:cs="Times New Roman"/>
+          <w:lang w:val="id-ID"/>
+        </w:rPr>
+        <w:t xml:space="preserve">. Doa Marcel terkabul, setelah Marcel menutup mata </w:t>
+      </w:r>
+      <w:proofErr w:type="spellStart"/>
+      <w:r>
+        <w:rPr>
+          <w:rFonts w:ascii="Times New Roman" w:hAnsi="Times New Roman" w:cs="Times New Roman"/>
+          <w:lang w:val="id-ID"/>
+        </w:rPr>
+        <w:t>nya</w:t>
+      </w:r>
+      <w:proofErr w:type="spellEnd"/>
+      <w:r>
+        <w:rPr>
+          <w:rFonts w:ascii="Times New Roman" w:hAnsi="Times New Roman" w:cs="Times New Roman"/>
+          <w:lang w:val="id-ID"/>
+        </w:rPr>
+        <w:t xml:space="preserve">, dan menyerahkan diri kepada Tuhan, Marcel terbangun dengan sudah digendong oleh seseorang. Frans seorang Arsitek bangunan di </w:t>
+      </w:r>
+      <w:proofErr w:type="spellStart"/>
+      <w:r>
+        <w:rPr>
+          <w:rFonts w:ascii="Times New Roman" w:hAnsi="Times New Roman" w:cs="Times New Roman"/>
+          <w:i/>
+          <w:iCs/>
+          <w:lang w:val="id-ID"/>
+        </w:rPr>
+        <w:t>Chongzhi</w:t>
+      </w:r>
+      <w:proofErr w:type="spellEnd"/>
+      <w:r>
+        <w:rPr>
+          <w:rFonts w:ascii="Times New Roman" w:hAnsi="Times New Roman" w:cs="Times New Roman"/>
+          <w:lang w:val="id-ID"/>
+        </w:rPr>
+        <w:t xml:space="preserve"> membawa Marcel ke sebuah gua di puncak gunung di Pegunungan Himalaya. Frans </w:t>
+      </w:r>
+      <w:proofErr w:type="spellStart"/>
+      <w:r>
+        <w:rPr>
+          <w:rFonts w:ascii="Times New Roman" w:hAnsi="Times New Roman" w:cs="Times New Roman"/>
+          <w:lang w:val="id-ID"/>
+        </w:rPr>
+        <w:t>Danielus</w:t>
+      </w:r>
+      <w:proofErr w:type="spellEnd"/>
+      <w:r>
+        <w:rPr>
+          <w:rFonts w:ascii="Times New Roman" w:hAnsi="Times New Roman" w:cs="Times New Roman"/>
+          <w:lang w:val="id-ID"/>
+        </w:rPr>
+        <w:t xml:space="preserve">, sangat terkenal sebagai Arsitek bangunan di </w:t>
+      </w:r>
+      <w:proofErr w:type="spellStart"/>
+      <w:r>
+        <w:rPr>
+          <w:rFonts w:ascii="Times New Roman" w:hAnsi="Times New Roman" w:cs="Times New Roman"/>
+          <w:i/>
+          <w:iCs/>
+          <w:lang w:val="id-ID"/>
+        </w:rPr>
+        <w:t>Chongzhi</w:t>
+      </w:r>
+      <w:proofErr w:type="spellEnd"/>
+      <w:r>
+        <w:rPr>
+          <w:rFonts w:ascii="Times New Roman" w:hAnsi="Times New Roman" w:cs="Times New Roman"/>
+          <w:lang w:val="id-ID"/>
+        </w:rPr>
+        <w:t xml:space="preserve">, Frans punya impian sendiri di dalam Rumah </w:t>
+      </w:r>
+      <w:proofErr w:type="spellStart"/>
+      <w:r>
+        <w:rPr>
+          <w:rFonts w:ascii="Times New Roman" w:hAnsi="Times New Roman" w:cs="Times New Roman"/>
+          <w:lang w:val="id-ID"/>
+        </w:rPr>
+        <w:t>nya</w:t>
+      </w:r>
+      <w:proofErr w:type="spellEnd"/>
+      <w:r>
+        <w:rPr>
+          <w:rFonts w:ascii="Times New Roman" w:hAnsi="Times New Roman" w:cs="Times New Roman"/>
+          <w:lang w:val="id-ID"/>
+        </w:rPr>
+        <w:t xml:space="preserve">, yaitu membuat Robot sendiri. Frans sudah lama mempunyai impian untuk membuat Robot sendiri, tapi terkendala masalah keuangan. “Dari mana asal </w:t>
+      </w:r>
+      <w:proofErr w:type="spellStart"/>
+      <w:r>
+        <w:rPr>
+          <w:rFonts w:ascii="Times New Roman" w:hAnsi="Times New Roman" w:cs="Times New Roman"/>
+          <w:lang w:val="id-ID"/>
+        </w:rPr>
+        <w:t>mu</w:t>
+      </w:r>
+      <w:proofErr w:type="spellEnd"/>
+      <w:r>
+        <w:rPr>
+          <w:rFonts w:ascii="Times New Roman" w:hAnsi="Times New Roman" w:cs="Times New Roman"/>
+          <w:lang w:val="id-ID"/>
+        </w:rPr>
+        <w:t>?.”, Marcel heran, kenapa Frans bisa bahasa Inggris. “</w:t>
+      </w:r>
+      <w:proofErr w:type="spellStart"/>
+      <w:r>
+        <w:rPr>
+          <w:rFonts w:ascii="Times New Roman" w:hAnsi="Times New Roman" w:cs="Times New Roman"/>
+          <w:i/>
+          <w:iCs/>
+          <w:lang w:val="id-ID"/>
+        </w:rPr>
+        <w:t>I’m</w:t>
+      </w:r>
+      <w:proofErr w:type="spellEnd"/>
+      <w:r>
+        <w:rPr>
+          <w:rFonts w:ascii="Times New Roman" w:hAnsi="Times New Roman" w:cs="Times New Roman"/>
+          <w:i/>
+          <w:iCs/>
+          <w:lang w:val="id-ID"/>
+        </w:rPr>
+        <w:t xml:space="preserve"> </w:t>
+      </w:r>
+      <w:proofErr w:type="spellStart"/>
+      <w:r>
+        <w:rPr>
+          <w:rFonts w:ascii="Times New Roman" w:hAnsi="Times New Roman" w:cs="Times New Roman"/>
+          <w:i/>
+          <w:iCs/>
+          <w:lang w:val="id-ID"/>
+        </w:rPr>
+        <w:t>from</w:t>
+      </w:r>
+      <w:proofErr w:type="spellEnd"/>
+      <w:r>
+        <w:rPr>
+          <w:rFonts w:ascii="Times New Roman" w:hAnsi="Times New Roman" w:cs="Times New Roman"/>
+          <w:i/>
+          <w:iCs/>
+          <w:lang w:val="id-ID"/>
+        </w:rPr>
+        <w:t xml:space="preserve"> Wales</w:t>
+      </w:r>
+      <w:r>
+        <w:rPr>
+          <w:rFonts w:ascii="Times New Roman" w:hAnsi="Times New Roman" w:cs="Times New Roman"/>
+          <w:lang w:val="id-ID"/>
+        </w:rPr>
+        <w:t xml:space="preserve">.”, Marcel sangat kedinginan, tapi Syukurlah Marcel sudah kenyang dengan daging beruang kutub dan susu beruang kutub yang telah ia makan dan minum. Marcel heran, daging beruang harus </w:t>
+      </w:r>
+      <w:proofErr w:type="spellStart"/>
+      <w:r>
+        <w:rPr>
+          <w:rFonts w:ascii="Times New Roman" w:hAnsi="Times New Roman" w:cs="Times New Roman"/>
+          <w:lang w:val="id-ID"/>
+        </w:rPr>
+        <w:t>nya</w:t>
+      </w:r>
+      <w:proofErr w:type="spellEnd"/>
+      <w:r>
+        <w:rPr>
+          <w:rFonts w:ascii="Times New Roman" w:hAnsi="Times New Roman" w:cs="Times New Roman"/>
+          <w:lang w:val="id-ID"/>
+        </w:rPr>
+        <w:t xml:space="preserve"> bau menyengat dan tidak enak sekali untuk dimakan, tapi kenapa </w:t>
+      </w:r>
+      <w:proofErr w:type="spellStart"/>
+      <w:r>
+        <w:rPr>
+          <w:rFonts w:ascii="Times New Roman" w:hAnsi="Times New Roman" w:cs="Times New Roman"/>
+          <w:i/>
+          <w:iCs/>
+          <w:lang w:val="id-ID"/>
+        </w:rPr>
+        <w:t>Steak</w:t>
+      </w:r>
+      <w:proofErr w:type="spellEnd"/>
+      <w:r>
+        <w:rPr>
+          <w:rFonts w:ascii="Times New Roman" w:hAnsi="Times New Roman" w:cs="Times New Roman"/>
+          <w:lang w:val="id-ID"/>
+        </w:rPr>
+        <w:t xml:space="preserve"> Beruang Kutub ini, “</w:t>
+      </w:r>
+      <w:proofErr w:type="spellStart"/>
+      <w:r>
+        <w:rPr>
+          <w:rFonts w:ascii="Times New Roman" w:hAnsi="Times New Roman" w:cs="Times New Roman"/>
+          <w:i/>
+          <w:iCs/>
+          <w:lang w:val="id-ID"/>
+        </w:rPr>
+        <w:t>Delicious</w:t>
+      </w:r>
+      <w:proofErr w:type="spellEnd"/>
+      <w:r>
+        <w:rPr>
+          <w:rFonts w:ascii="Times New Roman" w:hAnsi="Times New Roman" w:cs="Times New Roman"/>
+          <w:i/>
+          <w:iCs/>
+          <w:lang w:val="id-ID"/>
+        </w:rPr>
+        <w:t>!</w:t>
+      </w:r>
+      <w:r>
+        <w:rPr>
+          <w:rFonts w:ascii="Times New Roman" w:hAnsi="Times New Roman" w:cs="Times New Roman"/>
+          <w:lang w:val="id-ID"/>
+        </w:rPr>
+        <w:t xml:space="preserve">.” Marcel melahap semua </w:t>
+      </w:r>
+      <w:proofErr w:type="spellStart"/>
+      <w:r>
+        <w:rPr>
+          <w:rFonts w:ascii="Times New Roman" w:hAnsi="Times New Roman" w:cs="Times New Roman"/>
+          <w:i/>
+          <w:iCs/>
+          <w:lang w:val="id-ID"/>
+        </w:rPr>
+        <w:t>Steak</w:t>
+      </w:r>
+      <w:proofErr w:type="spellEnd"/>
+      <w:r>
+        <w:rPr>
+          <w:rFonts w:ascii="Times New Roman" w:hAnsi="Times New Roman" w:cs="Times New Roman"/>
+          <w:lang w:val="id-ID"/>
+        </w:rPr>
+        <w:t xml:space="preserve"> Beruang Kutub tersebut dengan sangat senang dan Bahagia, Marcel juga tidak tahu susu Beruang Kutub bisa diminum. “</w:t>
+      </w:r>
+      <w:proofErr w:type="spellStart"/>
+      <w:r>
+        <w:rPr>
+          <w:rFonts w:ascii="Times New Roman" w:hAnsi="Times New Roman" w:cs="Times New Roman"/>
+          <w:i/>
+          <w:iCs/>
+          <w:lang w:val="id-ID"/>
+        </w:rPr>
+        <w:t>Ugh</w:t>
+      </w:r>
+      <w:proofErr w:type="spellEnd"/>
+      <w:r>
+        <w:rPr>
+          <w:rFonts w:ascii="Times New Roman" w:hAnsi="Times New Roman" w:cs="Times New Roman"/>
+          <w:i/>
+          <w:iCs/>
+          <w:lang w:val="id-ID"/>
+        </w:rPr>
+        <w:t xml:space="preserve">!, </w:t>
+      </w:r>
+      <w:proofErr w:type="spellStart"/>
+      <w:r>
+        <w:rPr>
+          <w:rFonts w:ascii="Times New Roman" w:hAnsi="Times New Roman" w:cs="Times New Roman"/>
+          <w:i/>
+          <w:iCs/>
+          <w:lang w:val="id-ID"/>
+        </w:rPr>
+        <w:t>you</w:t>
+      </w:r>
+      <w:proofErr w:type="spellEnd"/>
+      <w:r>
+        <w:rPr>
+          <w:rFonts w:ascii="Times New Roman" w:hAnsi="Times New Roman" w:cs="Times New Roman"/>
+          <w:i/>
+          <w:iCs/>
+          <w:lang w:val="id-ID"/>
+        </w:rPr>
+        <w:t xml:space="preserve"> </w:t>
+      </w:r>
+      <w:proofErr w:type="spellStart"/>
+      <w:r>
+        <w:rPr>
+          <w:rFonts w:ascii="Times New Roman" w:hAnsi="Times New Roman" w:cs="Times New Roman"/>
+          <w:i/>
+          <w:iCs/>
+          <w:lang w:val="id-ID"/>
+        </w:rPr>
+        <w:t>from</w:t>
+      </w:r>
+      <w:proofErr w:type="spellEnd"/>
+      <w:r>
+        <w:rPr>
+          <w:rFonts w:ascii="Times New Roman" w:hAnsi="Times New Roman" w:cs="Times New Roman"/>
+          <w:i/>
+          <w:iCs/>
+          <w:lang w:val="id-ID"/>
+        </w:rPr>
+        <w:t>?</w:t>
+      </w:r>
+      <w:r>
+        <w:rPr>
+          <w:rFonts w:ascii="Times New Roman" w:hAnsi="Times New Roman" w:cs="Times New Roman"/>
+          <w:lang w:val="id-ID"/>
+        </w:rPr>
+        <w:t xml:space="preserve">.”, Marcel bertanya. Frans menghela nafas </w:t>
+      </w:r>
+      <w:proofErr w:type="spellStart"/>
+      <w:r>
+        <w:rPr>
+          <w:rFonts w:ascii="Times New Roman" w:hAnsi="Times New Roman" w:cs="Times New Roman"/>
+          <w:lang w:val="id-ID"/>
+        </w:rPr>
+        <w:t>nya</w:t>
+      </w:r>
+      <w:proofErr w:type="spellEnd"/>
+      <w:r>
+        <w:rPr>
+          <w:rFonts w:ascii="Times New Roman" w:hAnsi="Times New Roman" w:cs="Times New Roman"/>
+          <w:lang w:val="id-ID"/>
+        </w:rPr>
+        <w:t xml:space="preserve">, dan memberitahukan bahwa ini adalah perintah dari Samuel untuk menyelamatkan Marcel dari kejaran Debat. Samuel tahu, 3 Penunggang kuda tidak bisa dikalahkan oleh Marcel, oleh karena itu Samuel membawa kabur Marcel ke Kerajaan </w:t>
+      </w:r>
+      <w:proofErr w:type="spellStart"/>
+      <w:r>
+        <w:rPr>
+          <w:rFonts w:ascii="Times New Roman" w:hAnsi="Times New Roman" w:cs="Times New Roman"/>
+          <w:i/>
+          <w:iCs/>
+          <w:lang w:val="id-ID"/>
+        </w:rPr>
+        <w:t>Chongzhi</w:t>
+      </w:r>
+      <w:proofErr w:type="spellEnd"/>
+      <w:r>
+        <w:rPr>
+          <w:rFonts w:ascii="Times New Roman" w:hAnsi="Times New Roman" w:cs="Times New Roman"/>
+          <w:lang w:val="id-ID"/>
+        </w:rPr>
+        <w:t xml:space="preserve">. “Tidur </w:t>
+      </w:r>
+      <w:proofErr w:type="spellStart"/>
+      <w:r>
+        <w:rPr>
+          <w:rFonts w:ascii="Times New Roman" w:hAnsi="Times New Roman" w:cs="Times New Roman"/>
+          <w:lang w:val="id-ID"/>
+        </w:rPr>
+        <w:t>lah</w:t>
+      </w:r>
+      <w:proofErr w:type="spellEnd"/>
+      <w:r>
+        <w:rPr>
+          <w:rFonts w:ascii="Times New Roman" w:hAnsi="Times New Roman" w:cs="Times New Roman"/>
+          <w:lang w:val="id-ID"/>
+        </w:rPr>
+        <w:t>!, besok kita lanjutkan perjalanan kita ke India.”. Malam itu sangat dingin sekali, dan mereka berdua tidak tahu bahwa mereka telah diintai oleh seseorang.</w:t>
+      </w:r>
+    </w:p>
+    <w:p>
+      <w:pPr>
+        <w:spacing w:line="360" w:lineRule="auto"/>
+        <w:ind w:firstLine="720"/>
+        <w:rPr>
+          <w:rFonts w:ascii="Times New Roman" w:hAnsi="Times New Roman" w:cs="Times New Roman"/>
+          <w:lang w:val="id-ID"/>
+        </w:rPr>
+      </w:pPr>
+      <w:proofErr w:type="spellStart"/>
+      <w:r>
+        <w:rPr>
+          <w:rFonts w:ascii="Times New Roman" w:hAnsi="Times New Roman" w:cs="Times New Roman"/>
+          <w:lang w:val="id-ID"/>
+        </w:rPr>
+        <w:lastRenderedPageBreak/>
+        <w:t>Debes</w:t>
+      </w:r>
+      <w:proofErr w:type="spellEnd"/>
+      <w:r>
+        <w:rPr>
+          <w:rFonts w:ascii="Times New Roman" w:hAnsi="Times New Roman" w:cs="Times New Roman"/>
+          <w:lang w:val="id-ID"/>
+        </w:rPr>
+        <w:t xml:space="preserve"> masih mencari Debat, dan akhir </w:t>
+      </w:r>
+      <w:proofErr w:type="spellStart"/>
+      <w:r>
+        <w:rPr>
+          <w:rFonts w:ascii="Times New Roman" w:hAnsi="Times New Roman" w:cs="Times New Roman"/>
+          <w:lang w:val="id-ID"/>
+        </w:rPr>
+        <w:t>nya</w:t>
+      </w:r>
+      <w:proofErr w:type="spellEnd"/>
+      <w:r>
+        <w:rPr>
+          <w:rFonts w:ascii="Times New Roman" w:hAnsi="Times New Roman" w:cs="Times New Roman"/>
+          <w:lang w:val="id-ID"/>
+        </w:rPr>
+        <w:t xml:space="preserve"> </w:t>
+      </w:r>
+      <w:proofErr w:type="spellStart"/>
+      <w:r>
+        <w:rPr>
+          <w:rFonts w:ascii="Times New Roman" w:hAnsi="Times New Roman" w:cs="Times New Roman"/>
+          <w:lang w:val="id-ID"/>
+        </w:rPr>
+        <w:t>Debes</w:t>
+      </w:r>
+      <w:proofErr w:type="spellEnd"/>
+      <w:r>
+        <w:rPr>
+          <w:rFonts w:ascii="Times New Roman" w:hAnsi="Times New Roman" w:cs="Times New Roman"/>
+          <w:lang w:val="id-ID"/>
+        </w:rPr>
+        <w:t xml:space="preserve"> menemukan debat di sebuah kota terpencil bernama </w:t>
+      </w:r>
+      <w:proofErr w:type="spellStart"/>
+      <w:r>
+        <w:rPr>
+          <w:rFonts w:ascii="Times New Roman" w:hAnsi="Times New Roman" w:cs="Times New Roman"/>
+          <w:i/>
+          <w:iCs/>
+          <w:lang w:val="id-ID"/>
+        </w:rPr>
+        <w:t>Griffithstown</w:t>
+      </w:r>
+      <w:proofErr w:type="spellEnd"/>
+      <w:r>
+        <w:rPr>
+          <w:rFonts w:ascii="Times New Roman" w:hAnsi="Times New Roman" w:cs="Times New Roman"/>
+          <w:lang w:val="id-ID"/>
+        </w:rPr>
+        <w:t xml:space="preserve">. Dulu tempat itu sangat terpencil dan murah harga tanah </w:t>
+      </w:r>
+      <w:proofErr w:type="spellStart"/>
+      <w:r>
+        <w:rPr>
+          <w:rFonts w:ascii="Times New Roman" w:hAnsi="Times New Roman" w:cs="Times New Roman"/>
+          <w:lang w:val="id-ID"/>
+        </w:rPr>
+        <w:t>nya</w:t>
+      </w:r>
+      <w:proofErr w:type="spellEnd"/>
+      <w:r>
+        <w:rPr>
+          <w:rFonts w:ascii="Times New Roman" w:hAnsi="Times New Roman" w:cs="Times New Roman"/>
+          <w:lang w:val="id-ID"/>
+        </w:rPr>
+        <w:t xml:space="preserve">, sekarang Abad 20, tempat itu sangat mahal harga tanah </w:t>
+      </w:r>
+      <w:proofErr w:type="spellStart"/>
+      <w:r>
+        <w:rPr>
+          <w:rFonts w:ascii="Times New Roman" w:hAnsi="Times New Roman" w:cs="Times New Roman"/>
+          <w:lang w:val="id-ID"/>
+        </w:rPr>
+        <w:t>nya</w:t>
+      </w:r>
+      <w:proofErr w:type="spellEnd"/>
+      <w:r>
+        <w:rPr>
+          <w:rFonts w:ascii="Times New Roman" w:hAnsi="Times New Roman" w:cs="Times New Roman"/>
+          <w:lang w:val="id-ID"/>
+        </w:rPr>
+        <w:t xml:space="preserve">. Di </w:t>
+      </w:r>
+      <w:proofErr w:type="spellStart"/>
+      <w:r>
+        <w:rPr>
+          <w:rFonts w:ascii="Times New Roman" w:hAnsi="Times New Roman" w:cs="Times New Roman"/>
+          <w:lang w:val="id-ID"/>
+        </w:rPr>
+        <w:t>Griffithstown</w:t>
+      </w:r>
+      <w:proofErr w:type="spellEnd"/>
+      <w:r>
+        <w:rPr>
+          <w:rFonts w:ascii="Times New Roman" w:hAnsi="Times New Roman" w:cs="Times New Roman"/>
+          <w:lang w:val="id-ID"/>
+        </w:rPr>
+        <w:t xml:space="preserve">, Debat heran tiba – tiba ia bisa ada di sana, padahal ia yakin ia tidak berada di Kota </w:t>
+      </w:r>
+      <w:proofErr w:type="spellStart"/>
+      <w:r>
+        <w:rPr>
+          <w:rFonts w:ascii="Times New Roman" w:hAnsi="Times New Roman" w:cs="Times New Roman"/>
+          <w:i/>
+          <w:iCs/>
+          <w:lang w:val="id-ID"/>
+        </w:rPr>
+        <w:t>Blackwood</w:t>
+      </w:r>
+      <w:proofErr w:type="spellEnd"/>
+      <w:r>
+        <w:rPr>
+          <w:rFonts w:ascii="Times New Roman" w:hAnsi="Times New Roman" w:cs="Times New Roman"/>
+          <w:lang w:val="id-ID"/>
+        </w:rPr>
+        <w:t xml:space="preserve">. </w:t>
+      </w:r>
+      <w:proofErr w:type="spellStart"/>
+      <w:r>
+        <w:rPr>
+          <w:rFonts w:ascii="Times New Roman" w:hAnsi="Times New Roman" w:cs="Times New Roman"/>
+          <w:lang w:val="id-ID"/>
+        </w:rPr>
+        <w:t>Debes</w:t>
+      </w:r>
+      <w:proofErr w:type="spellEnd"/>
+      <w:r>
+        <w:rPr>
+          <w:rFonts w:ascii="Times New Roman" w:hAnsi="Times New Roman" w:cs="Times New Roman"/>
+          <w:lang w:val="id-ID"/>
+        </w:rPr>
+        <w:t xml:space="preserve"> membawa kembali Debat ke Kerajaan, </w:t>
+      </w:r>
+      <w:proofErr w:type="spellStart"/>
+      <w:r>
+        <w:rPr>
+          <w:rFonts w:ascii="Times New Roman" w:hAnsi="Times New Roman" w:cs="Times New Roman"/>
+          <w:lang w:val="id-ID"/>
+        </w:rPr>
+        <w:t>Debes</w:t>
+      </w:r>
+      <w:proofErr w:type="spellEnd"/>
+      <w:r>
+        <w:rPr>
+          <w:rFonts w:ascii="Times New Roman" w:hAnsi="Times New Roman" w:cs="Times New Roman"/>
+          <w:lang w:val="id-ID"/>
+        </w:rPr>
+        <w:t xml:space="preserve"> memberitahukan semua </w:t>
+      </w:r>
+      <w:proofErr w:type="spellStart"/>
+      <w:r>
+        <w:rPr>
+          <w:rFonts w:ascii="Times New Roman" w:hAnsi="Times New Roman" w:cs="Times New Roman"/>
+          <w:lang w:val="id-ID"/>
+        </w:rPr>
+        <w:t>nya</w:t>
+      </w:r>
+      <w:proofErr w:type="spellEnd"/>
+      <w:r>
+        <w:rPr>
+          <w:rFonts w:ascii="Times New Roman" w:hAnsi="Times New Roman" w:cs="Times New Roman"/>
+          <w:lang w:val="id-ID"/>
+        </w:rPr>
+        <w:t xml:space="preserve"> kepada Debat, mengenai rencana Raja Inggris untuk membebaskan </w:t>
+      </w:r>
+      <w:proofErr w:type="spellStart"/>
+      <w:r>
+        <w:rPr>
+          <w:rFonts w:ascii="Times New Roman" w:hAnsi="Times New Roman" w:cs="Times New Roman"/>
+          <w:lang w:val="id-ID"/>
+        </w:rPr>
+        <w:t>Cerberus</w:t>
+      </w:r>
+      <w:proofErr w:type="spellEnd"/>
+      <w:r>
+        <w:rPr>
+          <w:rFonts w:ascii="Times New Roman" w:hAnsi="Times New Roman" w:cs="Times New Roman"/>
+          <w:lang w:val="id-ID"/>
+        </w:rPr>
+        <w:t>. Debat sangat ketakutan, dan Debat tidak punya pilihan lain selain menggunakan cara tersebut.</w:t>
+      </w:r>
+    </w:p>
+    <w:p>
+      <w:pPr>
+        <w:spacing w:line="360" w:lineRule="auto"/>
+        <w:ind w:firstLine="720"/>
+        <w:rPr>
+          <w:rFonts w:ascii="Times New Roman" w:hAnsi="Times New Roman" w:cs="Times New Roman"/>
+          <w:lang w:val="id-ID"/>
+        </w:rPr>
+      </w:pPr>
+      <w:r>
+        <w:rPr>
+          <w:rFonts w:ascii="Times New Roman" w:hAnsi="Times New Roman" w:cs="Times New Roman"/>
+          <w:lang w:val="id-ID"/>
+        </w:rPr>
+        <w:t>Pagi Hari, Tahun 1841. Frans membawa Marcel ke India, ia berkata bahwa mereka harus bertemu dengan Iwan, seorang Mekanik yang adalah Kawan Baik Samuel (Karena Samuel juga seorang Mekanik). Iwan tingga</w:t>
+      </w:r>
+      <w:r>
+        <w:rPr>
+          <w:rFonts w:ascii="Times New Roman" w:hAnsi="Times New Roman" w:cs="Times New Roman"/>
+          <w:lang w:val="id-ID"/>
+        </w:rPr>
+        <w:t xml:space="preserve">l di Baghdad, India. Mereka berjalan kaki sejauh itu hanya untuk menemui Iwan, karena mereka harus memperbaiki jam tangan Omega pemberian Samuel kepada Frans di sana. Samuel memerintahkan Frans untuk segera bertemu dengan Iwan karena perintah selanjut </w:t>
+      </w:r>
+      <w:proofErr w:type="spellStart"/>
+      <w:r>
+        <w:rPr>
+          <w:rFonts w:ascii="Times New Roman" w:hAnsi="Times New Roman" w:cs="Times New Roman"/>
+          <w:lang w:val="id-ID"/>
+        </w:rPr>
+        <w:t>nya</w:t>
+      </w:r>
+      <w:proofErr w:type="spellEnd"/>
+      <w:r>
+        <w:rPr>
+          <w:rFonts w:ascii="Times New Roman" w:hAnsi="Times New Roman" w:cs="Times New Roman"/>
+          <w:lang w:val="id-ID"/>
+        </w:rPr>
+        <w:t xml:space="preserve"> akan diberitahukan di sana. Raja Jack mengeluarkan kekuatan </w:t>
+      </w:r>
+      <w:proofErr w:type="spellStart"/>
+      <w:r>
+        <w:rPr>
+          <w:rFonts w:ascii="Times New Roman" w:hAnsi="Times New Roman" w:cs="Times New Roman"/>
+          <w:lang w:val="id-ID"/>
+        </w:rPr>
+        <w:t>nya</w:t>
+      </w:r>
+      <w:proofErr w:type="spellEnd"/>
+      <w:r>
+        <w:rPr>
+          <w:rFonts w:ascii="Times New Roman" w:hAnsi="Times New Roman" w:cs="Times New Roman"/>
+          <w:lang w:val="id-ID"/>
+        </w:rPr>
+        <w:t xml:space="preserve"> di tengah keramaian pasar “ </w:t>
+      </w:r>
+      <w:proofErr w:type="spellStart"/>
+      <w:r>
+        <w:rPr>
+          <w:rFonts w:ascii="Times New Roman" w:hAnsi="Times New Roman" w:cs="Times New Roman"/>
+          <w:lang w:val="id-ID"/>
+        </w:rPr>
+        <w:t>Emeperor</w:t>
+      </w:r>
+      <w:proofErr w:type="spellEnd"/>
+      <w:r>
+        <w:rPr>
+          <w:rFonts w:ascii="Times New Roman" w:hAnsi="Times New Roman" w:cs="Times New Roman"/>
+          <w:lang w:val="id-ID"/>
+        </w:rPr>
+        <w:t xml:space="preserve"> </w:t>
+      </w:r>
+      <w:proofErr w:type="spellStart"/>
+      <w:r>
+        <w:rPr>
+          <w:rFonts w:ascii="Times New Roman" w:hAnsi="Times New Roman" w:cs="Times New Roman"/>
+          <w:lang w:val="id-ID"/>
+        </w:rPr>
+        <w:t>Clone</w:t>
+      </w:r>
+      <w:proofErr w:type="spellEnd"/>
+      <w:r>
+        <w:rPr>
+          <w:rFonts w:ascii="Times New Roman" w:hAnsi="Times New Roman" w:cs="Times New Roman"/>
+          <w:lang w:val="id-ID"/>
+        </w:rPr>
+        <w:t xml:space="preserve"> . . . ”, dengan nada rendah ia mengeluarkan putri – putri bayangan </w:t>
+      </w:r>
+      <w:proofErr w:type="spellStart"/>
+      <w:r>
+        <w:rPr>
+          <w:rFonts w:ascii="Times New Roman" w:hAnsi="Times New Roman" w:cs="Times New Roman"/>
+          <w:lang w:val="id-ID"/>
+        </w:rPr>
+        <w:t>nya</w:t>
+      </w:r>
+      <w:proofErr w:type="spellEnd"/>
+      <w:r>
+        <w:rPr>
+          <w:rFonts w:ascii="Times New Roman" w:hAnsi="Times New Roman" w:cs="Times New Roman"/>
+          <w:lang w:val="id-ID"/>
+        </w:rPr>
+        <w:t xml:space="preserve"> yang menyamar sebagai pedagang di pasar. Yang tidak mereka </w:t>
+      </w:r>
+      <w:proofErr w:type="spellStart"/>
+      <w:r>
+        <w:rPr>
+          <w:rFonts w:ascii="Times New Roman" w:hAnsi="Times New Roman" w:cs="Times New Roman"/>
+          <w:lang w:val="id-ID"/>
+        </w:rPr>
+        <w:t>ketahui</w:t>
+      </w:r>
+      <w:proofErr w:type="spellEnd"/>
+      <w:r>
+        <w:rPr>
+          <w:rFonts w:ascii="Times New Roman" w:hAnsi="Times New Roman" w:cs="Times New Roman"/>
+          <w:lang w:val="id-ID"/>
+        </w:rPr>
+        <w:t xml:space="preserve">, putri – putri bayangan ini mempunyai kekuatan </w:t>
+      </w:r>
+      <w:proofErr w:type="spellStart"/>
+      <w:r>
+        <w:rPr>
+          <w:rFonts w:ascii="Times New Roman" w:hAnsi="Times New Roman" w:cs="Times New Roman"/>
+          <w:lang w:val="id-ID"/>
+        </w:rPr>
+        <w:t>nya</w:t>
+      </w:r>
+      <w:proofErr w:type="spellEnd"/>
+      <w:r>
+        <w:rPr>
+          <w:rFonts w:ascii="Times New Roman" w:hAnsi="Times New Roman" w:cs="Times New Roman"/>
+          <w:lang w:val="id-ID"/>
+        </w:rPr>
+        <w:t xml:space="preserve"> juga </w:t>
+      </w:r>
+      <w:proofErr w:type="spellStart"/>
+      <w:r>
+        <w:rPr>
+          <w:rFonts w:ascii="Times New Roman" w:hAnsi="Times New Roman" w:cs="Times New Roman"/>
+          <w:lang w:val="id-ID"/>
+        </w:rPr>
+        <w:t>masing</w:t>
+      </w:r>
+      <w:proofErr w:type="spellEnd"/>
+      <w:r>
+        <w:rPr>
+          <w:rFonts w:ascii="Times New Roman" w:hAnsi="Times New Roman" w:cs="Times New Roman"/>
+          <w:lang w:val="id-ID"/>
+        </w:rPr>
+        <w:t xml:space="preserve"> – </w:t>
+      </w:r>
+      <w:proofErr w:type="spellStart"/>
+      <w:r>
+        <w:rPr>
+          <w:rFonts w:ascii="Times New Roman" w:hAnsi="Times New Roman" w:cs="Times New Roman"/>
+          <w:lang w:val="id-ID"/>
+        </w:rPr>
+        <w:t>masing</w:t>
+      </w:r>
+      <w:proofErr w:type="spellEnd"/>
+      <w:r>
+        <w:rPr>
+          <w:rFonts w:ascii="Times New Roman" w:hAnsi="Times New Roman" w:cs="Times New Roman"/>
+          <w:lang w:val="id-ID"/>
+        </w:rPr>
+        <w:t xml:space="preserve">, jika tidak karena kekuatan Level 1 Jack ini, tidak mungkin Jack Bisa menjadi Raja di Kerajaan </w:t>
+      </w:r>
+      <w:proofErr w:type="spellStart"/>
+      <w:r>
+        <w:rPr>
+          <w:rFonts w:ascii="Times New Roman" w:hAnsi="Times New Roman" w:cs="Times New Roman"/>
+          <w:i/>
+          <w:iCs/>
+          <w:lang w:val="id-ID"/>
+        </w:rPr>
+        <w:t>Chongzhi</w:t>
+      </w:r>
+      <w:proofErr w:type="spellEnd"/>
+      <w:r>
+        <w:rPr>
+          <w:rFonts w:ascii="Times New Roman" w:hAnsi="Times New Roman" w:cs="Times New Roman"/>
+          <w:lang w:val="id-ID"/>
+        </w:rPr>
+        <w:t xml:space="preserve">. Raja Jack mempunyai kekuatan yang jauh melampaui kekuatan Frans, oleh karena itu </w:t>
+      </w:r>
+      <w:proofErr w:type="spellStart"/>
+      <w:r>
+        <w:rPr>
+          <w:rFonts w:ascii="Times New Roman" w:hAnsi="Times New Roman" w:cs="Times New Roman"/>
+          <w:lang w:val="id-ID"/>
+        </w:rPr>
+        <w:t>Irvant</w:t>
+      </w:r>
+      <w:proofErr w:type="spellEnd"/>
+      <w:r>
+        <w:rPr>
+          <w:rFonts w:ascii="Times New Roman" w:hAnsi="Times New Roman" w:cs="Times New Roman"/>
+          <w:lang w:val="id-ID"/>
+        </w:rPr>
+        <w:t xml:space="preserve"> sudah menunggu dari kejauhan di atas puncak Kota dengan menggunakan </w:t>
+      </w:r>
+      <w:proofErr w:type="spellStart"/>
+      <w:r>
+        <w:rPr>
+          <w:rFonts w:ascii="Times New Roman" w:hAnsi="Times New Roman" w:cs="Times New Roman"/>
+          <w:lang w:val="id-ID"/>
+        </w:rPr>
+        <w:t>Sniper</w:t>
+      </w:r>
+      <w:proofErr w:type="spellEnd"/>
+      <w:r>
+        <w:rPr>
+          <w:rFonts w:ascii="Times New Roman" w:hAnsi="Times New Roman" w:cs="Times New Roman"/>
+          <w:lang w:val="id-ID"/>
+        </w:rPr>
+        <w:t xml:space="preserve"> pemberian dari </w:t>
+      </w:r>
+      <w:proofErr w:type="spellStart"/>
+      <w:r>
+        <w:rPr>
+          <w:rFonts w:ascii="Times New Roman" w:hAnsi="Times New Roman" w:cs="Times New Roman"/>
+          <w:lang w:val="id-ID"/>
+        </w:rPr>
+        <w:t>Duin</w:t>
+      </w:r>
+      <w:proofErr w:type="spellEnd"/>
+      <w:r>
+        <w:rPr>
+          <w:rFonts w:ascii="Times New Roman" w:hAnsi="Times New Roman" w:cs="Times New Roman"/>
+          <w:lang w:val="id-ID"/>
+        </w:rPr>
+        <w:t xml:space="preserve">. </w:t>
+      </w:r>
+      <w:proofErr w:type="spellStart"/>
+      <w:r>
+        <w:rPr>
+          <w:rFonts w:ascii="Times New Roman" w:hAnsi="Times New Roman" w:cs="Times New Roman"/>
+          <w:lang w:val="id-ID"/>
+        </w:rPr>
+        <w:t>Irvant</w:t>
+      </w:r>
+      <w:proofErr w:type="spellEnd"/>
+      <w:r>
+        <w:rPr>
+          <w:rFonts w:ascii="Times New Roman" w:hAnsi="Times New Roman" w:cs="Times New Roman"/>
+          <w:lang w:val="id-ID"/>
+        </w:rPr>
+        <w:t xml:space="preserve">, dikenal sebagai </w:t>
+      </w:r>
+      <w:proofErr w:type="spellStart"/>
+      <w:r>
+        <w:rPr>
+          <w:rFonts w:ascii="Times New Roman" w:hAnsi="Times New Roman" w:cs="Times New Roman"/>
+          <w:lang w:val="id-ID"/>
+        </w:rPr>
+        <w:t>Outlaw</w:t>
+      </w:r>
+      <w:proofErr w:type="spellEnd"/>
+      <w:r>
+        <w:rPr>
+          <w:rFonts w:ascii="Times New Roman" w:hAnsi="Times New Roman" w:cs="Times New Roman"/>
+          <w:lang w:val="id-ID"/>
+        </w:rPr>
+        <w:t xml:space="preserve"> di India, sebenar </w:t>
+      </w:r>
+      <w:proofErr w:type="spellStart"/>
+      <w:r>
+        <w:rPr>
+          <w:rFonts w:ascii="Times New Roman" w:hAnsi="Times New Roman" w:cs="Times New Roman"/>
+          <w:lang w:val="id-ID"/>
+        </w:rPr>
+        <w:t>nya</w:t>
+      </w:r>
+      <w:proofErr w:type="spellEnd"/>
+      <w:r>
+        <w:rPr>
+          <w:rFonts w:ascii="Times New Roman" w:hAnsi="Times New Roman" w:cs="Times New Roman"/>
+          <w:lang w:val="id-ID"/>
+        </w:rPr>
+        <w:t xml:space="preserve"> </w:t>
+      </w:r>
+      <w:proofErr w:type="spellStart"/>
+      <w:r>
+        <w:rPr>
+          <w:rFonts w:ascii="Times New Roman" w:hAnsi="Times New Roman" w:cs="Times New Roman"/>
+          <w:lang w:val="id-ID"/>
+        </w:rPr>
+        <w:t>Irvant</w:t>
+      </w:r>
+      <w:proofErr w:type="spellEnd"/>
+      <w:r>
+        <w:rPr>
+          <w:rFonts w:ascii="Times New Roman" w:hAnsi="Times New Roman" w:cs="Times New Roman"/>
+          <w:lang w:val="id-ID"/>
+        </w:rPr>
+        <w:t xml:space="preserve"> berasal dari Kerajaan </w:t>
+      </w:r>
+      <w:proofErr w:type="spellStart"/>
+      <w:r>
+        <w:rPr>
+          <w:rFonts w:ascii="Times New Roman" w:hAnsi="Times New Roman" w:cs="Times New Roman"/>
+          <w:i/>
+          <w:iCs/>
+          <w:lang w:val="id-ID"/>
+        </w:rPr>
+        <w:t>Chongzhi</w:t>
+      </w:r>
+      <w:proofErr w:type="spellEnd"/>
+      <w:r>
+        <w:rPr>
+          <w:rFonts w:ascii="Times New Roman" w:hAnsi="Times New Roman" w:cs="Times New Roman"/>
+          <w:lang w:val="id-ID"/>
+        </w:rPr>
+        <w:t xml:space="preserve">. </w:t>
+      </w:r>
+      <w:proofErr w:type="spellStart"/>
+      <w:r>
+        <w:rPr>
+          <w:rFonts w:ascii="Times New Roman" w:hAnsi="Times New Roman" w:cs="Times New Roman"/>
+          <w:lang w:val="id-ID"/>
+        </w:rPr>
+        <w:t>Irvant</w:t>
+      </w:r>
+      <w:proofErr w:type="spellEnd"/>
+      <w:r>
+        <w:rPr>
+          <w:rFonts w:ascii="Times New Roman" w:hAnsi="Times New Roman" w:cs="Times New Roman"/>
+          <w:lang w:val="id-ID"/>
+        </w:rPr>
+        <w:t xml:space="preserve"> menembak habis putri – putri bayangan Raja Jack. </w:t>
+      </w:r>
+      <w:proofErr w:type="spellStart"/>
+      <w:r>
+        <w:rPr>
+          <w:rFonts w:ascii="Times New Roman" w:hAnsi="Times New Roman" w:cs="Times New Roman"/>
+          <w:lang w:val="id-ID"/>
+        </w:rPr>
+        <w:t>Irvant</w:t>
+      </w:r>
+      <w:proofErr w:type="spellEnd"/>
+      <w:r>
+        <w:rPr>
+          <w:rFonts w:ascii="Times New Roman" w:hAnsi="Times New Roman" w:cs="Times New Roman"/>
+          <w:lang w:val="id-ID"/>
+        </w:rPr>
+        <w:t xml:space="preserve"> memberi perintah kepada Nova untuk memberitahukan Frans bahwa mereka tidak aman. Nova menepuk pundak Frans dan memberi </w:t>
+      </w:r>
+      <w:proofErr w:type="spellStart"/>
+      <w:r>
+        <w:rPr>
+          <w:rFonts w:ascii="Times New Roman" w:hAnsi="Times New Roman" w:cs="Times New Roman"/>
+          <w:lang w:val="id-ID"/>
+        </w:rPr>
+        <w:t>intruksi</w:t>
+      </w:r>
+      <w:proofErr w:type="spellEnd"/>
+      <w:r>
+        <w:rPr>
+          <w:rFonts w:ascii="Times New Roman" w:hAnsi="Times New Roman" w:cs="Times New Roman"/>
+          <w:lang w:val="id-ID"/>
+        </w:rPr>
+        <w:t xml:space="preserve">. “Kita harus pergi dari sini!.” Dengan sembunyi – sembunyi Frans membawa Marcel pelan keluar dari kerumunan. Raja Jack kehilangan jejak mereka, Raja Jack mendapat pesan dari Taka, seorang burung elang laut yang dikirim debat dari Wales. Raja Jack kembali ke Wales dan meninggalkan mereka berdua. Mereka akhir </w:t>
+      </w:r>
+      <w:proofErr w:type="spellStart"/>
+      <w:r>
+        <w:rPr>
+          <w:rFonts w:ascii="Times New Roman" w:hAnsi="Times New Roman" w:cs="Times New Roman"/>
+          <w:lang w:val="id-ID"/>
+        </w:rPr>
+        <w:t>nya</w:t>
+      </w:r>
+      <w:proofErr w:type="spellEnd"/>
+      <w:r>
+        <w:rPr>
+          <w:rFonts w:ascii="Times New Roman" w:hAnsi="Times New Roman" w:cs="Times New Roman"/>
+          <w:lang w:val="id-ID"/>
+        </w:rPr>
+        <w:t xml:space="preserve"> bisa selamat juga, </w:t>
+      </w:r>
+      <w:proofErr w:type="spellStart"/>
+      <w:r>
+        <w:rPr>
+          <w:rFonts w:ascii="Times New Roman" w:hAnsi="Times New Roman" w:cs="Times New Roman"/>
+          <w:i/>
+          <w:iCs/>
+          <w:lang w:val="id-ID"/>
+        </w:rPr>
+        <w:t>Fuh</w:t>
+      </w:r>
+      <w:proofErr w:type="spellEnd"/>
+      <w:r>
+        <w:rPr>
+          <w:rFonts w:ascii="Times New Roman" w:hAnsi="Times New Roman" w:cs="Times New Roman"/>
+          <w:i/>
+          <w:iCs/>
+          <w:lang w:val="id-ID"/>
+        </w:rPr>
+        <w:t>!</w:t>
+      </w:r>
+      <w:r>
+        <w:rPr>
+          <w:rFonts w:ascii="Times New Roman" w:hAnsi="Times New Roman" w:cs="Times New Roman"/>
+          <w:lang w:val="id-ID"/>
+        </w:rPr>
+        <w:t>. “</w:t>
+      </w:r>
+      <w:proofErr w:type="spellStart"/>
+      <w:r>
+        <w:rPr>
+          <w:rFonts w:ascii="Times New Roman" w:hAnsi="Times New Roman" w:cs="Times New Roman"/>
+          <w:i/>
+          <w:iCs/>
+          <w:lang w:val="id-ID"/>
+        </w:rPr>
+        <w:t>It</w:t>
+      </w:r>
+      <w:proofErr w:type="spellEnd"/>
+      <w:r>
+        <w:rPr>
+          <w:rFonts w:ascii="Times New Roman" w:hAnsi="Times New Roman" w:cs="Times New Roman"/>
+          <w:i/>
+          <w:iCs/>
+          <w:lang w:val="id-ID"/>
+        </w:rPr>
+        <w:t xml:space="preserve"> </w:t>
+      </w:r>
+      <w:proofErr w:type="spellStart"/>
+      <w:r>
+        <w:rPr>
+          <w:rFonts w:ascii="Times New Roman" w:hAnsi="Times New Roman" w:cs="Times New Roman"/>
+          <w:i/>
+          <w:iCs/>
+          <w:lang w:val="id-ID"/>
+        </w:rPr>
+        <w:t>was</w:t>
+      </w:r>
+      <w:proofErr w:type="spellEnd"/>
+      <w:r>
+        <w:rPr>
+          <w:rFonts w:ascii="Times New Roman" w:hAnsi="Times New Roman" w:cs="Times New Roman"/>
+          <w:i/>
+          <w:iCs/>
+          <w:lang w:val="id-ID"/>
+        </w:rPr>
+        <w:t xml:space="preserve"> </w:t>
+      </w:r>
+      <w:proofErr w:type="spellStart"/>
+      <w:r>
+        <w:rPr>
+          <w:rFonts w:ascii="Times New Roman" w:hAnsi="Times New Roman" w:cs="Times New Roman"/>
+          <w:i/>
+          <w:iCs/>
+          <w:lang w:val="id-ID"/>
+        </w:rPr>
+        <w:t>close</w:t>
+      </w:r>
+      <w:proofErr w:type="spellEnd"/>
+      <w:r>
+        <w:rPr>
+          <w:rFonts w:ascii="Times New Roman" w:hAnsi="Times New Roman" w:cs="Times New Roman"/>
+          <w:i/>
+          <w:iCs/>
+          <w:lang w:val="id-ID"/>
+        </w:rPr>
+        <w:t>!</w:t>
+      </w:r>
+      <w:r>
+        <w:rPr>
+          <w:rFonts w:ascii="Times New Roman" w:hAnsi="Times New Roman" w:cs="Times New Roman"/>
+          <w:lang w:val="id-ID"/>
+        </w:rPr>
+        <w:t xml:space="preserve">.” Marcel kelaparan dan akhir </w:t>
+      </w:r>
+      <w:proofErr w:type="spellStart"/>
+      <w:r>
+        <w:rPr>
+          <w:rFonts w:ascii="Times New Roman" w:hAnsi="Times New Roman" w:cs="Times New Roman"/>
+          <w:lang w:val="id-ID"/>
+        </w:rPr>
+        <w:t>nya</w:t>
+      </w:r>
+      <w:proofErr w:type="spellEnd"/>
+      <w:r>
+        <w:rPr>
+          <w:rFonts w:ascii="Times New Roman" w:hAnsi="Times New Roman" w:cs="Times New Roman"/>
+          <w:lang w:val="id-ID"/>
+        </w:rPr>
+        <w:t xml:space="preserve"> mereka berdua makan di </w:t>
+      </w:r>
+      <w:r>
+        <w:rPr>
+          <w:rFonts w:ascii="Times New Roman" w:hAnsi="Times New Roman" w:cs="Times New Roman"/>
+          <w:lang w:val="id-ID"/>
+        </w:rPr>
+        <w:lastRenderedPageBreak/>
+        <w:t xml:space="preserve">salah satu kedai India. “Berapa semua </w:t>
+      </w:r>
+      <w:proofErr w:type="spellStart"/>
+      <w:r>
+        <w:rPr>
+          <w:rFonts w:ascii="Times New Roman" w:hAnsi="Times New Roman" w:cs="Times New Roman"/>
+          <w:lang w:val="id-ID"/>
+        </w:rPr>
+        <w:t>nya</w:t>
+      </w:r>
+      <w:proofErr w:type="spellEnd"/>
+      <w:r>
+        <w:rPr>
+          <w:rFonts w:ascii="Times New Roman" w:hAnsi="Times New Roman" w:cs="Times New Roman"/>
+          <w:lang w:val="id-ID"/>
+        </w:rPr>
+        <w:t xml:space="preserve"> Bu?.” Sebelum sempat Frans membayar “Ibu? Panggil aku Kak!.” Mereka tidak tahu ternyata </w:t>
+      </w:r>
+      <w:proofErr w:type="spellStart"/>
+      <w:r>
+        <w:rPr>
+          <w:rFonts w:ascii="Times New Roman" w:hAnsi="Times New Roman" w:cs="Times New Roman"/>
+          <w:lang w:val="id-ID"/>
+        </w:rPr>
+        <w:t>Debes</w:t>
+      </w:r>
+      <w:proofErr w:type="spellEnd"/>
+      <w:r>
+        <w:rPr>
+          <w:rFonts w:ascii="Times New Roman" w:hAnsi="Times New Roman" w:cs="Times New Roman"/>
+          <w:lang w:val="id-ID"/>
+        </w:rPr>
+        <w:t xml:space="preserve"> sudah menebas pedang yang hampir mengenai mereka Frans tiba – tiba saja loncat dan membawa lari Marcel.</w:t>
+      </w:r>
+      <w:r>
+        <w:rPr>
+          <w:rFonts w:ascii="Times New Roman" w:hAnsi="Times New Roman" w:cs="Times New Roman"/>
+          <w:lang w:val="id-ID"/>
+        </w:rPr>
+        <w:t xml:space="preserve"> “</w:t>
+      </w:r>
+      <w:proofErr w:type="spellStart"/>
+      <w:r>
+        <w:rPr>
+          <w:rFonts w:ascii="Times New Roman" w:hAnsi="Times New Roman" w:cs="Times New Roman"/>
+          <w:i/>
+          <w:iCs/>
+          <w:lang w:val="id-ID"/>
+        </w:rPr>
+        <w:t>That’s</w:t>
+      </w:r>
+      <w:proofErr w:type="spellEnd"/>
+      <w:r>
+        <w:rPr>
+          <w:rFonts w:ascii="Times New Roman" w:hAnsi="Times New Roman" w:cs="Times New Roman"/>
+          <w:i/>
+          <w:iCs/>
+          <w:lang w:val="id-ID"/>
+        </w:rPr>
+        <w:t xml:space="preserve"> Hard </w:t>
+      </w:r>
+      <w:proofErr w:type="spellStart"/>
+      <w:r>
+        <w:rPr>
+          <w:rFonts w:ascii="Times New Roman" w:hAnsi="Times New Roman" w:cs="Times New Roman"/>
+          <w:i/>
+          <w:iCs/>
+          <w:lang w:val="id-ID"/>
+        </w:rPr>
+        <w:t>to</w:t>
+      </w:r>
+      <w:proofErr w:type="spellEnd"/>
+      <w:r>
+        <w:rPr>
+          <w:rFonts w:ascii="Times New Roman" w:hAnsi="Times New Roman" w:cs="Times New Roman"/>
+          <w:i/>
+          <w:iCs/>
+          <w:lang w:val="id-ID"/>
+        </w:rPr>
+        <w:t xml:space="preserve"> </w:t>
+      </w:r>
+      <w:proofErr w:type="spellStart"/>
+      <w:r>
+        <w:rPr>
+          <w:rFonts w:ascii="Times New Roman" w:hAnsi="Times New Roman" w:cs="Times New Roman"/>
+          <w:i/>
+          <w:iCs/>
+          <w:lang w:val="id-ID"/>
+        </w:rPr>
+        <w:t>Dangerous</w:t>
+      </w:r>
+      <w:proofErr w:type="spellEnd"/>
+      <w:r>
+        <w:rPr>
+          <w:rFonts w:ascii="Times New Roman" w:hAnsi="Times New Roman" w:cs="Times New Roman"/>
+          <w:i/>
+          <w:iCs/>
+          <w:lang w:val="id-ID"/>
+        </w:rPr>
+        <w:t>!</w:t>
+      </w:r>
+      <w:r>
+        <w:rPr>
+          <w:rFonts w:ascii="Times New Roman" w:hAnsi="Times New Roman" w:cs="Times New Roman"/>
+          <w:lang w:val="id-ID"/>
+        </w:rPr>
+        <w:t xml:space="preserve">.” Frans mencoba menjelaskan kepada Marcel bahwa di sini mereka tidak mungkin selamat. Seseorang mencoba mendekati mereka, ternyata itu Iwan. Iwan membawa mereka lari jauh dari menginap di Apartemen milik </w:t>
+      </w:r>
+      <w:proofErr w:type="spellStart"/>
+      <w:r>
+        <w:rPr>
+          <w:rFonts w:ascii="Times New Roman" w:hAnsi="Times New Roman" w:cs="Times New Roman"/>
+          <w:lang w:val="id-ID"/>
+        </w:rPr>
+        <w:t>nya</w:t>
+      </w:r>
+      <w:proofErr w:type="spellEnd"/>
+      <w:r>
+        <w:rPr>
+          <w:rFonts w:ascii="Times New Roman" w:hAnsi="Times New Roman" w:cs="Times New Roman"/>
+          <w:lang w:val="id-ID"/>
+        </w:rPr>
+        <w:t xml:space="preserve"> di Baghdad. Frans menunggu perintah dari Samuel di tempat Iwan, karena jam tangan Omega telah selesai diperbaiki Iwan. Iwan memperingati mereka, karena mereka telah dilacak oleh 3 Penunggang kuda. </w:t>
+      </w:r>
+      <w:proofErr w:type="spellStart"/>
+      <w:r>
+        <w:rPr>
+          <w:rFonts w:ascii="Times New Roman" w:hAnsi="Times New Roman" w:cs="Times New Roman"/>
+          <w:lang w:val="id-ID"/>
+        </w:rPr>
+        <w:t>Debes</w:t>
+      </w:r>
+      <w:proofErr w:type="spellEnd"/>
+      <w:r>
+        <w:rPr>
+          <w:rFonts w:ascii="Times New Roman" w:hAnsi="Times New Roman" w:cs="Times New Roman"/>
+          <w:lang w:val="id-ID"/>
+        </w:rPr>
+        <w:t xml:space="preserve"> sudah berada di depan pintu </w:t>
+      </w:r>
+      <w:proofErr w:type="spellStart"/>
+      <w:r>
+        <w:rPr>
+          <w:rFonts w:ascii="Times New Roman" w:hAnsi="Times New Roman" w:cs="Times New Roman"/>
+          <w:lang w:val="id-ID"/>
+        </w:rPr>
+        <w:t>Apertemen</w:t>
+      </w:r>
+      <w:proofErr w:type="spellEnd"/>
+      <w:r>
+        <w:rPr>
+          <w:rFonts w:ascii="Times New Roman" w:hAnsi="Times New Roman" w:cs="Times New Roman"/>
+          <w:lang w:val="id-ID"/>
+        </w:rPr>
+        <w:t xml:space="preserve"> Iwan, bersama dengan Debut. “Debut...”, “Baik!”, “</w:t>
+      </w:r>
+      <w:proofErr w:type="spellStart"/>
+      <w:r>
+        <w:rPr>
+          <w:rFonts w:ascii="Times New Roman" w:hAnsi="Times New Roman" w:cs="Times New Roman"/>
+          <w:lang w:val="id-ID"/>
+        </w:rPr>
+        <w:t>Restart</w:t>
+      </w:r>
+      <w:proofErr w:type="spellEnd"/>
+      <w:r>
+        <w:rPr>
+          <w:rFonts w:ascii="Times New Roman" w:hAnsi="Times New Roman" w:cs="Times New Roman"/>
+          <w:lang w:val="id-ID"/>
+        </w:rPr>
+        <w:t xml:space="preserve">!”. </w:t>
+      </w:r>
+    </w:p>
+    <w:p>
+      <w:pPr>
+        <w:spacing w:line="360" w:lineRule="auto"/>
+        <w:ind w:firstLine="720"/>
+        <w:rPr>
+          <w:rFonts w:ascii="Times New Roman" w:hAnsi="Times New Roman" w:cs="Times New Roman"/>
+          <w:lang w:val="id-ID"/>
+        </w:rPr>
+      </w:pPr>
+      <w:r>
+        <w:rPr>
+          <w:rFonts w:ascii="Times New Roman" w:hAnsi="Times New Roman" w:cs="Times New Roman"/>
+          <w:lang w:val="id-ID"/>
+        </w:rPr>
+        <w:t xml:space="preserve">Inggris, 1840. Seorang Petani tua menangis karena mengalami kesulitan panen. Panen tahun ini sangat sulit untuk mengadakan pesta panen, karena hujan salju yang sangat hebat. Raja Inggris pada waktu itu mengenakan Pajak yang sangat tinggi pada Petani. Di wilayah Wales terkenal 3 Penunggang kuda, yaitu Debat, </w:t>
+      </w:r>
+      <w:proofErr w:type="spellStart"/>
+      <w:r>
+        <w:rPr>
+          <w:rFonts w:ascii="Times New Roman" w:hAnsi="Times New Roman" w:cs="Times New Roman"/>
+          <w:lang w:val="id-ID"/>
+        </w:rPr>
+        <w:t>Debes</w:t>
+      </w:r>
+      <w:proofErr w:type="spellEnd"/>
+      <w:r>
+        <w:rPr>
+          <w:rFonts w:ascii="Times New Roman" w:hAnsi="Times New Roman" w:cs="Times New Roman"/>
+          <w:lang w:val="id-ID"/>
+        </w:rPr>
+        <w:t xml:space="preserve"> dan Debut. 3 Penunggang kuda ini yang menarik pajak tinggi kepada para petani yang mengirimkannya ke Raja Inggris. Raja Inggris suka makan hati angsa dan menikah dengan para selir. 3 Penunggang kuda ini memiliki Kekuatan mereka </w:t>
+      </w:r>
+      <w:proofErr w:type="spellStart"/>
+      <w:r>
+        <w:rPr>
+          <w:rFonts w:ascii="Times New Roman" w:hAnsi="Times New Roman" w:cs="Times New Roman"/>
+          <w:lang w:val="id-ID"/>
+        </w:rPr>
+        <w:t>masing</w:t>
+      </w:r>
+      <w:proofErr w:type="spellEnd"/>
+      <w:r>
+        <w:rPr>
+          <w:rFonts w:ascii="Times New Roman" w:hAnsi="Times New Roman" w:cs="Times New Roman"/>
+          <w:lang w:val="id-ID"/>
+        </w:rPr>
+        <w:t xml:space="preserve"> – </w:t>
+      </w:r>
+      <w:proofErr w:type="spellStart"/>
+      <w:r>
+        <w:rPr>
+          <w:rFonts w:ascii="Times New Roman" w:hAnsi="Times New Roman" w:cs="Times New Roman"/>
+          <w:lang w:val="id-ID"/>
+        </w:rPr>
+        <w:t>masing</w:t>
+      </w:r>
+      <w:proofErr w:type="spellEnd"/>
+      <w:r>
+        <w:rPr>
+          <w:rFonts w:ascii="Times New Roman" w:hAnsi="Times New Roman" w:cs="Times New Roman"/>
+          <w:lang w:val="id-ID"/>
+        </w:rPr>
+        <w:t xml:space="preserve">. Suatu kali, Debat menagih pajak kepada seorang tukang foto bernama Marcel. Marcel sangat ketakutan dan bersembunyi di salah satu Toko Obat seorang Tabib dekat sebuah sumur di suatu Kota Tua, di Wilayah Wales. Meskipun di Wales, tapi Marcel heran dengan tulisan di Toko Obat itu, Huruf yang digunakan pada Toko Obat itu tidak dikenal oleh Marcel. Debat mengejar Marcel, awal </w:t>
+      </w:r>
+      <w:proofErr w:type="spellStart"/>
+      <w:r>
+        <w:rPr>
+          <w:rFonts w:ascii="Times New Roman" w:hAnsi="Times New Roman" w:cs="Times New Roman"/>
+          <w:lang w:val="id-ID"/>
+        </w:rPr>
+        <w:t>nya</w:t>
+      </w:r>
+      <w:proofErr w:type="spellEnd"/>
+      <w:r>
+        <w:rPr>
+          <w:rFonts w:ascii="Times New Roman" w:hAnsi="Times New Roman" w:cs="Times New Roman"/>
+          <w:lang w:val="id-ID"/>
+        </w:rPr>
+        <w:t xml:space="preserve"> Debat berteriak tetapi heran </w:t>
+      </w:r>
+      <w:proofErr w:type="spellStart"/>
+      <w:r>
+        <w:rPr>
+          <w:rFonts w:ascii="Times New Roman" w:hAnsi="Times New Roman" w:cs="Times New Roman"/>
+          <w:lang w:val="id-ID"/>
+        </w:rPr>
+        <w:t>nya</w:t>
+      </w:r>
+      <w:proofErr w:type="spellEnd"/>
+      <w:r>
+        <w:rPr>
+          <w:rFonts w:ascii="Times New Roman" w:hAnsi="Times New Roman" w:cs="Times New Roman"/>
+          <w:lang w:val="id-ID"/>
+        </w:rPr>
+        <w:t xml:space="preserve"> suara </w:t>
+      </w:r>
+      <w:proofErr w:type="spellStart"/>
+      <w:r>
+        <w:rPr>
+          <w:rFonts w:ascii="Times New Roman" w:hAnsi="Times New Roman" w:cs="Times New Roman"/>
+          <w:lang w:val="id-ID"/>
+        </w:rPr>
+        <w:t>nya</w:t>
+      </w:r>
+      <w:proofErr w:type="spellEnd"/>
+      <w:r>
+        <w:rPr>
+          <w:rFonts w:ascii="Times New Roman" w:hAnsi="Times New Roman" w:cs="Times New Roman"/>
+          <w:lang w:val="id-ID"/>
+        </w:rPr>
+        <w:t xml:space="preserve"> semakin lama menghilang. “ </w:t>
+      </w:r>
+      <w:proofErr w:type="spellStart"/>
+      <w:r>
+        <w:rPr>
+          <w:rFonts w:ascii="Times New Roman" w:hAnsi="Times New Roman" w:cs="Times New Roman"/>
+          <w:lang w:val="id-ID"/>
+        </w:rPr>
+        <w:t>Lín</w:t>
+      </w:r>
+      <w:proofErr w:type="spellEnd"/>
+      <w:r>
+        <w:rPr>
+          <w:rFonts w:ascii="Times New Roman" w:hAnsi="Times New Roman" w:cs="Times New Roman"/>
+          <w:lang w:val="id-ID"/>
+        </w:rPr>
+        <w:t xml:space="preserve"> </w:t>
+      </w:r>
+      <w:proofErr w:type="spellStart"/>
+      <w:r>
+        <w:rPr>
+          <w:rFonts w:ascii="Times New Roman" w:hAnsi="Times New Roman" w:cs="Times New Roman"/>
+          <w:lang w:val="id-ID"/>
+        </w:rPr>
+        <w:t>sài</w:t>
+      </w:r>
+      <w:proofErr w:type="spellEnd"/>
+      <w:r>
+        <w:rPr>
+          <w:rFonts w:ascii="Times New Roman" w:hAnsi="Times New Roman" w:cs="Times New Roman"/>
+          <w:lang w:val="id-ID"/>
+        </w:rPr>
+        <w:t xml:space="preserve"> </w:t>
+      </w:r>
+      <w:proofErr w:type="spellStart"/>
+      <w:r>
+        <w:rPr>
+          <w:rFonts w:ascii="Times New Roman" w:hAnsi="Times New Roman" w:cs="Times New Roman"/>
+          <w:lang w:val="id-ID"/>
+        </w:rPr>
+        <w:t>yóu</w:t>
+      </w:r>
+      <w:proofErr w:type="spellEnd"/>
+      <w:r>
+        <w:rPr>
+          <w:rFonts w:ascii="Times New Roman" w:hAnsi="Times New Roman" w:cs="Times New Roman"/>
+          <w:lang w:val="id-ID"/>
+        </w:rPr>
+        <w:t xml:space="preserve"> </w:t>
+      </w:r>
+      <w:proofErr w:type="spellStart"/>
+      <w:r>
+        <w:rPr>
+          <w:rFonts w:ascii="Times New Roman" w:hAnsi="Times New Roman" w:cs="Times New Roman"/>
+          <w:lang w:val="id-ID"/>
+        </w:rPr>
+        <w:t>ěr</w:t>
+      </w:r>
+      <w:proofErr w:type="spellEnd"/>
+      <w:r>
+        <w:rPr>
+          <w:rFonts w:ascii="Times New Roman" w:hAnsi="Times New Roman" w:cs="Times New Roman"/>
+          <w:lang w:val="id-ID"/>
+        </w:rPr>
+        <w:t xml:space="preserve">!. </w:t>
+      </w:r>
+      <w:proofErr w:type="spellStart"/>
+      <w:r>
+        <w:rPr>
+          <w:rFonts w:ascii="Times New Roman" w:hAnsi="Times New Roman" w:cs="Times New Roman"/>
+          <w:lang w:val="id-ID"/>
+        </w:rPr>
+        <w:t>Lín</w:t>
+      </w:r>
+      <w:proofErr w:type="spellEnd"/>
+      <w:r>
+        <w:rPr>
+          <w:rFonts w:ascii="Times New Roman" w:hAnsi="Times New Roman" w:cs="Times New Roman"/>
+          <w:lang w:val="id-ID"/>
+        </w:rPr>
+        <w:t xml:space="preserve"> </w:t>
+      </w:r>
+      <w:proofErr w:type="spellStart"/>
+      <w:r>
+        <w:rPr>
+          <w:rFonts w:ascii="Times New Roman" w:hAnsi="Times New Roman" w:cs="Times New Roman"/>
+          <w:lang w:val="id-ID"/>
+        </w:rPr>
+        <w:t>sài</w:t>
+      </w:r>
+      <w:proofErr w:type="spellEnd"/>
+      <w:r>
+        <w:rPr>
+          <w:rFonts w:ascii="Times New Roman" w:hAnsi="Times New Roman" w:cs="Times New Roman"/>
+          <w:lang w:val="id-ID"/>
+        </w:rPr>
+        <w:t xml:space="preserve"> </w:t>
+      </w:r>
+      <w:proofErr w:type="spellStart"/>
+      <w:r>
+        <w:rPr>
+          <w:rFonts w:ascii="Times New Roman" w:hAnsi="Times New Roman" w:cs="Times New Roman"/>
+          <w:lang w:val="id-ID"/>
+        </w:rPr>
+        <w:t>yóu</w:t>
+      </w:r>
+      <w:proofErr w:type="spellEnd"/>
+      <w:r>
+        <w:rPr>
+          <w:rFonts w:ascii="Times New Roman" w:hAnsi="Times New Roman" w:cs="Times New Roman"/>
+          <w:lang w:val="id-ID"/>
+        </w:rPr>
+        <w:t xml:space="preserve"> </w:t>
+      </w:r>
+      <w:proofErr w:type="spellStart"/>
+      <w:r>
+        <w:rPr>
+          <w:rFonts w:ascii="Times New Roman" w:hAnsi="Times New Roman" w:cs="Times New Roman"/>
+          <w:lang w:val="id-ID"/>
+        </w:rPr>
+        <w:t>ěr</w:t>
+      </w:r>
+      <w:proofErr w:type="spellEnd"/>
+      <w:r>
+        <w:rPr>
+          <w:rFonts w:ascii="Times New Roman" w:hAnsi="Times New Roman" w:cs="Times New Roman"/>
+          <w:lang w:val="id-ID"/>
+        </w:rPr>
+        <w:t xml:space="preserve">!.”, tiba – tiba terdengar teriakan tak Marcel tahu maksud </w:t>
+      </w:r>
+      <w:proofErr w:type="spellStart"/>
+      <w:r>
+        <w:rPr>
+          <w:rFonts w:ascii="Times New Roman" w:hAnsi="Times New Roman" w:cs="Times New Roman"/>
+          <w:lang w:val="id-ID"/>
+        </w:rPr>
+        <w:t>nya</w:t>
+      </w:r>
+      <w:proofErr w:type="spellEnd"/>
+      <w:r>
+        <w:rPr>
+          <w:rFonts w:ascii="Times New Roman" w:hAnsi="Times New Roman" w:cs="Times New Roman"/>
+          <w:lang w:val="id-ID"/>
+        </w:rPr>
+        <w:t xml:space="preserve">. Marcel bingung, kenapa orang – orang di sini berpakaian aneh, mereka memakai pakaian berwarna kuning dan biru, sedangkan pakaian orang – orang harus </w:t>
+      </w:r>
+      <w:proofErr w:type="spellStart"/>
+      <w:r>
+        <w:rPr>
+          <w:rFonts w:ascii="Times New Roman" w:hAnsi="Times New Roman" w:cs="Times New Roman"/>
+          <w:lang w:val="id-ID"/>
+        </w:rPr>
+        <w:t>nya</w:t>
+      </w:r>
+      <w:proofErr w:type="spellEnd"/>
+      <w:r>
+        <w:rPr>
+          <w:rFonts w:ascii="Times New Roman" w:hAnsi="Times New Roman" w:cs="Times New Roman"/>
+          <w:lang w:val="id-ID"/>
+        </w:rPr>
+        <w:t xml:space="preserve"> putih kan? Untuk menghindari 3 Penunggang kuda (Orang – orang di Wales menyamar </w:t>
+      </w:r>
+      <w:proofErr w:type="spellStart"/>
+      <w:r>
+        <w:rPr>
+          <w:rFonts w:ascii="Times New Roman" w:hAnsi="Times New Roman" w:cs="Times New Roman"/>
+          <w:lang w:val="id-ID"/>
+        </w:rPr>
+        <w:t>diantara</w:t>
+      </w:r>
+      <w:proofErr w:type="spellEnd"/>
+      <w:r>
+        <w:rPr>
+          <w:rFonts w:ascii="Times New Roman" w:hAnsi="Times New Roman" w:cs="Times New Roman"/>
+          <w:lang w:val="id-ID"/>
+        </w:rPr>
+        <w:t xml:space="preserve"> Salju). Marcel merupakan satu – satu </w:t>
+      </w:r>
+      <w:proofErr w:type="spellStart"/>
+      <w:r>
+        <w:rPr>
+          <w:rFonts w:ascii="Times New Roman" w:hAnsi="Times New Roman" w:cs="Times New Roman"/>
+          <w:lang w:val="id-ID"/>
+        </w:rPr>
+        <w:t>nya</w:t>
+      </w:r>
+      <w:proofErr w:type="spellEnd"/>
+      <w:r>
+        <w:rPr>
+          <w:rFonts w:ascii="Times New Roman" w:hAnsi="Times New Roman" w:cs="Times New Roman"/>
+          <w:lang w:val="id-ID"/>
+        </w:rPr>
+        <w:t xml:space="preserve"> tukang foto di Wales, karena Wales merupakan seorang Penemu Kamera Pertama di Dunia yang tidak pernah dicatat dalam Sejarah Dunia </w:t>
+      </w:r>
+      <w:r>
+        <w:rPr>
+          <w:rFonts w:ascii="Times New Roman" w:hAnsi="Times New Roman" w:cs="Times New Roman"/>
+          <w:lang w:val="id-ID"/>
+        </w:rPr>
+        <w:lastRenderedPageBreak/>
+        <w:t xml:space="preserve">(Kamera Pertama di Dunia diciptakan di Timur Tengah, tapi Keluarga Wales yang merupakan Keluarga Marcel sudah jauh lebih dulu menemukan Kamera terlebih dahulu). </w:t>
+      </w:r>
+    </w:p>
+    <w:p>
+      <w:pPr>
+        <w:spacing w:line="360" w:lineRule="auto"/>
+        <w:ind w:firstLine="720"/>
+        <w:rPr>
+          <w:rFonts w:ascii="Times New Roman" w:hAnsi="Times New Roman" w:cs="Times New Roman"/>
+          <w:lang w:val="id-ID"/>
+        </w:rPr>
+      </w:pPr>
+      <w:r>
+        <w:rPr>
+          <w:rFonts w:ascii="Times New Roman" w:hAnsi="Times New Roman" w:cs="Times New Roman"/>
+          <w:lang w:val="id-ID"/>
+        </w:rPr>
+        <w:t xml:space="preserve">Keluarga Wales dulu </w:t>
+      </w:r>
+      <w:proofErr w:type="spellStart"/>
+      <w:r>
+        <w:rPr>
+          <w:rFonts w:ascii="Times New Roman" w:hAnsi="Times New Roman" w:cs="Times New Roman"/>
+          <w:lang w:val="id-ID"/>
+        </w:rPr>
+        <w:t>nya</w:t>
+      </w:r>
+      <w:proofErr w:type="spellEnd"/>
+      <w:r>
+        <w:rPr>
+          <w:rFonts w:ascii="Times New Roman" w:hAnsi="Times New Roman" w:cs="Times New Roman"/>
+          <w:lang w:val="id-ID"/>
+        </w:rPr>
+        <w:t xml:space="preserve"> merupakan Keluarga Bangsawan, sebelum datang </w:t>
+      </w:r>
+      <w:proofErr w:type="spellStart"/>
+      <w:r>
+        <w:rPr>
+          <w:rFonts w:ascii="Times New Roman" w:hAnsi="Times New Roman" w:cs="Times New Roman"/>
+          <w:lang w:val="id-ID"/>
+        </w:rPr>
+        <w:t>nya</w:t>
+      </w:r>
+      <w:proofErr w:type="spellEnd"/>
+      <w:r>
+        <w:rPr>
+          <w:rFonts w:ascii="Times New Roman" w:hAnsi="Times New Roman" w:cs="Times New Roman"/>
+          <w:lang w:val="id-ID"/>
+        </w:rPr>
+        <w:t xml:space="preserve"> 3 orang pesulap, yang sekarang menjadi 3 Penunggang kuda (Debat, </w:t>
+      </w:r>
+      <w:proofErr w:type="spellStart"/>
+      <w:r>
+        <w:rPr>
+          <w:rFonts w:ascii="Times New Roman" w:hAnsi="Times New Roman" w:cs="Times New Roman"/>
+          <w:lang w:val="id-ID"/>
+        </w:rPr>
+        <w:t>Debes</w:t>
+      </w:r>
+      <w:proofErr w:type="spellEnd"/>
+      <w:r>
+        <w:rPr>
+          <w:rFonts w:ascii="Times New Roman" w:hAnsi="Times New Roman" w:cs="Times New Roman"/>
+          <w:lang w:val="id-ID"/>
+        </w:rPr>
+        <w:t xml:space="preserve">, dan Debut). 3 Penunggang kuda memberantas semua Keluarga Wales kecuali, Marcel Wales. Marcel melihat ke jendela, hari semakin malam dan Marcel kelaparan. Di Toko Obat itu terdapat Roti basi, seperti </w:t>
+      </w:r>
+      <w:proofErr w:type="spellStart"/>
+      <w:r>
+        <w:rPr>
+          <w:rFonts w:ascii="Times New Roman" w:hAnsi="Times New Roman" w:cs="Times New Roman"/>
+          <w:lang w:val="id-ID"/>
+        </w:rPr>
+        <w:t>nya</w:t>
+      </w:r>
+      <w:proofErr w:type="spellEnd"/>
+      <w:r>
+        <w:rPr>
+          <w:rFonts w:ascii="Times New Roman" w:hAnsi="Times New Roman" w:cs="Times New Roman"/>
+          <w:lang w:val="id-ID"/>
+        </w:rPr>
+        <w:t xml:space="preserve"> sudah sangat lama, berjamur dan bau basi. Marcel terpaksa memakan Roti itu karena sangat hebat </w:t>
+      </w:r>
+      <w:proofErr w:type="spellStart"/>
+      <w:r>
+        <w:rPr>
+          <w:rFonts w:ascii="Times New Roman" w:hAnsi="Times New Roman" w:cs="Times New Roman"/>
+          <w:lang w:val="id-ID"/>
+        </w:rPr>
+        <w:t>nya</w:t>
+      </w:r>
+      <w:proofErr w:type="spellEnd"/>
+      <w:r>
+        <w:rPr>
+          <w:rFonts w:ascii="Times New Roman" w:hAnsi="Times New Roman" w:cs="Times New Roman"/>
+          <w:lang w:val="id-ID"/>
+        </w:rPr>
+        <w:t xml:space="preserve"> kelaparan yang ia rasakan. Marcel tidak berani keluar Toko Obat tersebut, karena takut dengan orang sekitar, dan juga bangunan di sekitar </w:t>
+      </w:r>
+      <w:proofErr w:type="spellStart"/>
+      <w:r>
+        <w:rPr>
+          <w:rFonts w:ascii="Times New Roman" w:hAnsi="Times New Roman" w:cs="Times New Roman"/>
+          <w:lang w:val="id-ID"/>
+        </w:rPr>
+        <w:t>nya</w:t>
+      </w:r>
+      <w:proofErr w:type="spellEnd"/>
+      <w:r>
+        <w:rPr>
+          <w:rFonts w:ascii="Times New Roman" w:hAnsi="Times New Roman" w:cs="Times New Roman"/>
+          <w:lang w:val="id-ID"/>
+        </w:rPr>
+        <w:t xml:space="preserve"> seperti </w:t>
+      </w:r>
+      <w:proofErr w:type="spellStart"/>
+      <w:r>
+        <w:rPr>
+          <w:rFonts w:ascii="Times New Roman" w:hAnsi="Times New Roman" w:cs="Times New Roman"/>
+          <w:lang w:val="id-ID"/>
+        </w:rPr>
+        <w:t>nya</w:t>
+      </w:r>
+      <w:proofErr w:type="spellEnd"/>
+      <w:r>
+        <w:rPr>
+          <w:rFonts w:ascii="Times New Roman" w:hAnsi="Times New Roman" w:cs="Times New Roman"/>
+          <w:lang w:val="id-ID"/>
+        </w:rPr>
+        <w:t xml:space="preserve"> baru saja terkena gempa bumi. Rasa haus mulai menghampiri Marcel, Marcel mulai mengingat pertama kali ia menerima Bantuan Koin Emas dari Debat. Marcel masih tidak terima betapa licik </w:t>
+      </w:r>
+      <w:proofErr w:type="spellStart"/>
+      <w:r>
+        <w:rPr>
+          <w:rFonts w:ascii="Times New Roman" w:hAnsi="Times New Roman" w:cs="Times New Roman"/>
+          <w:lang w:val="id-ID"/>
+        </w:rPr>
+        <w:t>nya</w:t>
+      </w:r>
+      <w:proofErr w:type="spellEnd"/>
+      <w:r>
+        <w:rPr>
+          <w:rFonts w:ascii="Times New Roman" w:hAnsi="Times New Roman" w:cs="Times New Roman"/>
+          <w:lang w:val="id-ID"/>
+        </w:rPr>
+        <w:t xml:space="preserve"> Debat. Debat awal </w:t>
+      </w:r>
+      <w:proofErr w:type="spellStart"/>
+      <w:r>
+        <w:rPr>
+          <w:rFonts w:ascii="Times New Roman" w:hAnsi="Times New Roman" w:cs="Times New Roman"/>
+          <w:lang w:val="id-ID"/>
+        </w:rPr>
+        <w:t>nya</w:t>
+      </w:r>
+      <w:proofErr w:type="spellEnd"/>
+      <w:r>
+        <w:rPr>
+          <w:rFonts w:ascii="Times New Roman" w:hAnsi="Times New Roman" w:cs="Times New Roman"/>
+          <w:lang w:val="id-ID"/>
+        </w:rPr>
+        <w:t xml:space="preserve"> suka menolong Para Ilmuwan di Wales, Inggris. Dia suka sekali membagi Harta </w:t>
+      </w:r>
+      <w:proofErr w:type="spellStart"/>
+      <w:r>
+        <w:rPr>
+          <w:rFonts w:ascii="Times New Roman" w:hAnsi="Times New Roman" w:cs="Times New Roman"/>
+          <w:lang w:val="id-ID"/>
+        </w:rPr>
+        <w:t>nya</w:t>
+      </w:r>
+      <w:proofErr w:type="spellEnd"/>
+      <w:r>
+        <w:rPr>
+          <w:rFonts w:ascii="Times New Roman" w:hAnsi="Times New Roman" w:cs="Times New Roman"/>
+          <w:lang w:val="id-ID"/>
+        </w:rPr>
+        <w:t xml:space="preserve"> terutama Koin Emas yang ia dapat dari Hasil Pertunjukan Sulap </w:t>
+      </w:r>
+      <w:proofErr w:type="spellStart"/>
+      <w:r>
+        <w:rPr>
+          <w:rFonts w:ascii="Times New Roman" w:hAnsi="Times New Roman" w:cs="Times New Roman"/>
+          <w:lang w:val="id-ID"/>
+        </w:rPr>
+        <w:t>nya</w:t>
+      </w:r>
+      <w:proofErr w:type="spellEnd"/>
+      <w:r>
+        <w:rPr>
+          <w:rFonts w:ascii="Times New Roman" w:hAnsi="Times New Roman" w:cs="Times New Roman"/>
+          <w:lang w:val="id-ID"/>
+        </w:rPr>
+        <w:t xml:space="preserve"> sebagai 3 Penunggang kuda. Marcel masih tidak terima Debat begitu licik </w:t>
+      </w:r>
+      <w:proofErr w:type="spellStart"/>
+      <w:r>
+        <w:rPr>
+          <w:rFonts w:ascii="Times New Roman" w:hAnsi="Times New Roman" w:cs="Times New Roman"/>
+          <w:lang w:val="id-ID"/>
+        </w:rPr>
+        <w:t>nya</w:t>
+      </w:r>
+      <w:proofErr w:type="spellEnd"/>
+      <w:r>
+        <w:rPr>
+          <w:rFonts w:ascii="Times New Roman" w:hAnsi="Times New Roman" w:cs="Times New Roman"/>
+          <w:lang w:val="id-ID"/>
+        </w:rPr>
+        <w:t xml:space="preserve"> menipu dia dan Keluarga Wales, “</w:t>
+      </w:r>
+      <w:proofErr w:type="spellStart"/>
+      <w:r>
+        <w:rPr>
+          <w:rFonts w:ascii="Times New Roman" w:hAnsi="Times New Roman" w:cs="Times New Roman"/>
+          <w:lang w:val="id-ID"/>
+        </w:rPr>
+        <w:t>Seharus</w:t>
+      </w:r>
+      <w:proofErr w:type="spellEnd"/>
+      <w:r>
+        <w:rPr>
+          <w:rFonts w:ascii="Times New Roman" w:hAnsi="Times New Roman" w:cs="Times New Roman"/>
+          <w:lang w:val="id-ID"/>
+        </w:rPr>
+        <w:t xml:space="preserve"> </w:t>
+      </w:r>
+      <w:proofErr w:type="spellStart"/>
+      <w:r>
+        <w:rPr>
+          <w:rFonts w:ascii="Times New Roman" w:hAnsi="Times New Roman" w:cs="Times New Roman"/>
+          <w:lang w:val="id-ID"/>
+        </w:rPr>
+        <w:t>nya</w:t>
+      </w:r>
+      <w:proofErr w:type="spellEnd"/>
+      <w:r>
+        <w:rPr>
+          <w:rFonts w:ascii="Times New Roman" w:hAnsi="Times New Roman" w:cs="Times New Roman"/>
+          <w:lang w:val="id-ID"/>
+        </w:rPr>
+        <w:t xml:space="preserve"> Keluarga </w:t>
+      </w:r>
+      <w:proofErr w:type="spellStart"/>
+      <w:r>
+        <w:rPr>
+          <w:rFonts w:ascii="Times New Roman" w:hAnsi="Times New Roman" w:cs="Times New Roman"/>
+          <w:lang w:val="id-ID"/>
+        </w:rPr>
+        <w:t>ku</w:t>
+      </w:r>
+      <w:proofErr w:type="spellEnd"/>
+      <w:r>
+        <w:rPr>
+          <w:rFonts w:ascii="Times New Roman" w:hAnsi="Times New Roman" w:cs="Times New Roman"/>
+          <w:lang w:val="id-ID"/>
+        </w:rPr>
+        <w:t xml:space="preserve"> tidak menerima Bantuan Koin Emas itu!.”. Marcel tidak tahu jika Kekuatan Debat adalah “</w:t>
+      </w:r>
+      <w:proofErr w:type="spellStart"/>
+      <w:r>
+        <w:rPr>
+          <w:rFonts w:ascii="Times New Roman" w:hAnsi="Times New Roman" w:cs="Times New Roman"/>
+          <w:lang w:val="id-ID"/>
+        </w:rPr>
+        <w:t>Debt</w:t>
+      </w:r>
+      <w:proofErr w:type="spellEnd"/>
+      <w:r>
+        <w:rPr>
+          <w:rFonts w:ascii="Times New Roman" w:hAnsi="Times New Roman" w:cs="Times New Roman"/>
+          <w:lang w:val="id-ID"/>
+        </w:rPr>
+        <w:t xml:space="preserve">”, yaitu Kekuatan setiap orang yang berhutang Koin Emas dari Debat menjadi tidak Bisa Berbicara </w:t>
+      </w:r>
+      <w:proofErr w:type="spellStart"/>
+      <w:r>
+        <w:rPr>
+          <w:rFonts w:ascii="Times New Roman" w:hAnsi="Times New Roman" w:cs="Times New Roman"/>
+          <w:lang w:val="id-ID"/>
+        </w:rPr>
+        <w:t>dihadapan</w:t>
+      </w:r>
+      <w:proofErr w:type="spellEnd"/>
+      <w:r>
+        <w:rPr>
+          <w:rFonts w:ascii="Times New Roman" w:hAnsi="Times New Roman" w:cs="Times New Roman"/>
+          <w:lang w:val="id-ID"/>
+        </w:rPr>
+        <w:t xml:space="preserve"> Debat. Karena itu orang – orang, Terutama Petani di Wales, Inggris sangat takut dengan 3 Penunggang kuda tersebut. Marcel tahu, itu baru Debat, yang merupakan yang paling lemah dari 3 Penunggang kuda. Marcel tertidur sangat lama di Toko Obat itu. Hingga Pagi, ia Tersadar dan tidak punya tenaga untuk bergerak karena sangat kelaparan di Toko Obat itu. Tiba – tiba, terdengar Suara Pesta Meriah dari luar jendela, “</w:t>
+      </w:r>
+      <w:proofErr w:type="spellStart"/>
+      <w:r>
+        <w:rPr>
+          <w:rFonts w:ascii="Times New Roman" w:hAnsi="Times New Roman" w:cs="Times New Roman"/>
+          <w:lang w:val="id-ID"/>
+        </w:rPr>
+        <w:t>Decode</w:t>
+      </w:r>
+      <w:proofErr w:type="spellEnd"/>
+      <w:r>
+        <w:rPr>
+          <w:rFonts w:ascii="Times New Roman" w:hAnsi="Times New Roman" w:cs="Times New Roman"/>
+          <w:lang w:val="id-ID"/>
+        </w:rPr>
+        <w:t xml:space="preserve">!, </w:t>
+      </w:r>
+      <w:proofErr w:type="spellStart"/>
+      <w:r>
+        <w:rPr>
+          <w:rFonts w:ascii="Times New Roman" w:hAnsi="Times New Roman" w:cs="Times New Roman"/>
+          <w:lang w:val="id-ID"/>
+        </w:rPr>
+        <w:t>Decode</w:t>
+      </w:r>
+      <w:proofErr w:type="spellEnd"/>
+      <w:r>
+        <w:rPr>
+          <w:rFonts w:ascii="Times New Roman" w:hAnsi="Times New Roman" w:cs="Times New Roman"/>
+          <w:lang w:val="id-ID"/>
+        </w:rPr>
+        <w:t xml:space="preserve">!, </w:t>
+      </w:r>
+      <w:proofErr w:type="spellStart"/>
+      <w:r>
+        <w:rPr>
+          <w:rFonts w:ascii="Times New Roman" w:hAnsi="Times New Roman" w:cs="Times New Roman"/>
+          <w:lang w:val="id-ID"/>
+        </w:rPr>
+        <w:t>Decode</w:t>
+      </w:r>
+      <w:proofErr w:type="spellEnd"/>
+      <w:r>
+        <w:rPr>
+          <w:rFonts w:ascii="Times New Roman" w:hAnsi="Times New Roman" w:cs="Times New Roman"/>
+          <w:lang w:val="id-ID"/>
+        </w:rPr>
+        <w:t>!.”.</w:t>
+      </w:r>
+    </w:p>
+    <w:p>
+      <w:pPr>
+        <w:spacing w:line="360" w:lineRule="auto"/>
+        <w:ind w:firstLine="720"/>
+        <w:rPr>
+          <w:rFonts w:ascii="Times New Roman" w:hAnsi="Times New Roman" w:cs="Times New Roman"/>
+          <w:lang w:val="id-ID"/>
+        </w:rPr>
+      </w:pPr>
+    </w:p>
+    <w:p>
+      <w:pPr>
+        <w:spacing w:line="360" w:lineRule="auto"/>
+        <w:ind w:firstLine="720"/>
+        <w:rPr>
+          <w:rFonts w:ascii="Times New Roman" w:hAnsi="Times New Roman" w:cs="Times New Roman"/>
+          <w:lang w:val="id-ID"/>
+        </w:rPr>
+      </w:pPr>
+      <w:r>
+        <w:rPr>
+          <w:rFonts w:ascii="Times New Roman" w:hAnsi="Times New Roman" w:cs="Times New Roman"/>
+          <w:lang w:val="id-ID"/>
+        </w:rPr>
+        <w:t>Nama : Debat</w:t>
+      </w:r>
+    </w:p>
+    <w:p>
+      <w:pPr>
+        <w:spacing w:line="360" w:lineRule="auto"/>
+        <w:ind w:firstLine="720"/>
+        <w:rPr>
+          <w:rFonts w:ascii="Times New Roman" w:hAnsi="Times New Roman" w:cs="Times New Roman"/>
+          <w:lang w:val="id-ID"/>
+        </w:rPr>
+      </w:pPr>
+      <w:r>
+        <w:rPr>
+          <w:rFonts w:ascii="Times New Roman" w:hAnsi="Times New Roman" w:cs="Times New Roman"/>
+          <w:lang w:val="id-ID"/>
+        </w:rPr>
+        <w:lastRenderedPageBreak/>
+        <w:t xml:space="preserve">Salah satu dari 3 Penunggang kuda, merupakan satu – satu </w:t>
+      </w:r>
+      <w:proofErr w:type="spellStart"/>
+      <w:r>
+        <w:rPr>
+          <w:rFonts w:ascii="Times New Roman" w:hAnsi="Times New Roman" w:cs="Times New Roman"/>
+          <w:lang w:val="id-ID"/>
+        </w:rPr>
+        <w:t>nya</w:t>
+      </w:r>
+      <w:proofErr w:type="spellEnd"/>
+      <w:r>
+        <w:rPr>
+          <w:rFonts w:ascii="Times New Roman" w:hAnsi="Times New Roman" w:cs="Times New Roman"/>
+          <w:lang w:val="id-ID"/>
+        </w:rPr>
+        <w:t xml:space="preserve"> laki – laki dari 3 Penunggang kuda di Kerajaan Inggris di Wilayah Wales. Debat mengejar Marcel hingga ke Kerajaan </w:t>
+      </w:r>
+      <w:proofErr w:type="spellStart"/>
+      <w:r>
+        <w:rPr>
+          <w:rFonts w:ascii="Times New Roman" w:hAnsi="Times New Roman" w:cs="Times New Roman"/>
+          <w:i/>
+          <w:iCs/>
+          <w:lang w:val="id-ID"/>
+        </w:rPr>
+        <w:t>Chongzhi</w:t>
+      </w:r>
+      <w:proofErr w:type="spellEnd"/>
+      <w:r>
+        <w:rPr>
+          <w:rFonts w:ascii="Times New Roman" w:hAnsi="Times New Roman" w:cs="Times New Roman"/>
+          <w:lang w:val="id-ID"/>
+        </w:rPr>
+        <w:t xml:space="preserve">, tapi Debat tidak tahu bahwa Samuel Hadir di Toko Obat Kezia tempat Marcel bersembunyi. Debat mempunyai </w:t>
+      </w:r>
+      <w:proofErr w:type="spellStart"/>
+      <w:r>
+        <w:rPr>
+          <w:rFonts w:ascii="Times New Roman" w:hAnsi="Times New Roman" w:cs="Times New Roman"/>
+          <w:lang w:val="id-ID"/>
+        </w:rPr>
+        <w:t>Isteri</w:t>
+      </w:r>
+      <w:proofErr w:type="spellEnd"/>
+      <w:r>
+        <w:rPr>
+          <w:rFonts w:ascii="Times New Roman" w:hAnsi="Times New Roman" w:cs="Times New Roman"/>
+          <w:lang w:val="id-ID"/>
+        </w:rPr>
+        <w:t xml:space="preserve"> yaitu </w:t>
+      </w:r>
+      <w:proofErr w:type="spellStart"/>
+      <w:r>
+        <w:rPr>
+          <w:rFonts w:ascii="Times New Roman" w:hAnsi="Times New Roman" w:cs="Times New Roman"/>
+          <w:lang w:val="id-ID"/>
+        </w:rPr>
+        <w:t>Debes</w:t>
+      </w:r>
+      <w:proofErr w:type="spellEnd"/>
+      <w:r>
+        <w:rPr>
+          <w:rFonts w:ascii="Times New Roman" w:hAnsi="Times New Roman" w:cs="Times New Roman"/>
+          <w:lang w:val="id-ID"/>
+        </w:rPr>
+        <w:t xml:space="preserve">, dan seorang selir bernama Debut. Meskipun </w:t>
+      </w:r>
+      <w:proofErr w:type="spellStart"/>
+      <w:r>
+        <w:rPr>
+          <w:rFonts w:ascii="Times New Roman" w:hAnsi="Times New Roman" w:cs="Times New Roman"/>
+          <w:lang w:val="id-ID"/>
+        </w:rPr>
+        <w:t>Debes</w:t>
+      </w:r>
+      <w:proofErr w:type="spellEnd"/>
+      <w:r>
+        <w:rPr>
+          <w:rFonts w:ascii="Times New Roman" w:hAnsi="Times New Roman" w:cs="Times New Roman"/>
+          <w:lang w:val="id-ID"/>
+        </w:rPr>
+        <w:t xml:space="preserve"> merupakan </w:t>
+      </w:r>
+      <w:proofErr w:type="spellStart"/>
+      <w:r>
+        <w:rPr>
+          <w:rFonts w:ascii="Times New Roman" w:hAnsi="Times New Roman" w:cs="Times New Roman"/>
+          <w:lang w:val="id-ID"/>
+        </w:rPr>
+        <w:t>Isteri</w:t>
+      </w:r>
+      <w:proofErr w:type="spellEnd"/>
+      <w:r>
+        <w:rPr>
+          <w:rFonts w:ascii="Times New Roman" w:hAnsi="Times New Roman" w:cs="Times New Roman"/>
+          <w:lang w:val="id-ID"/>
+        </w:rPr>
+        <w:t xml:space="preserve"> Debat, tapi Debut merupakan Penunggang kuda Terkuat dari 3 Penunggang kuda. Debat menempuh jarak yang sangat jauh sekali dari Inggris ke Kerajaan </w:t>
+      </w:r>
+      <w:proofErr w:type="spellStart"/>
+      <w:r>
+        <w:rPr>
+          <w:rFonts w:ascii="Times New Roman" w:hAnsi="Times New Roman" w:cs="Times New Roman"/>
+          <w:i/>
+          <w:iCs/>
+          <w:lang w:val="id-ID"/>
+        </w:rPr>
+        <w:t>Chongzhi</w:t>
+      </w:r>
+      <w:proofErr w:type="spellEnd"/>
+      <w:r>
+        <w:rPr>
+          <w:rFonts w:ascii="Times New Roman" w:hAnsi="Times New Roman" w:cs="Times New Roman"/>
+          <w:lang w:val="id-ID"/>
+        </w:rPr>
+        <w:t xml:space="preserve">. Debat tahu, bahwa Marcel </w:t>
+      </w:r>
+      <w:proofErr w:type="spellStart"/>
+      <w:r>
+        <w:rPr>
+          <w:rFonts w:ascii="Times New Roman" w:hAnsi="Times New Roman" w:cs="Times New Roman"/>
+          <w:lang w:val="id-ID"/>
+        </w:rPr>
+        <w:t>meruapakan</w:t>
+      </w:r>
+      <w:proofErr w:type="spellEnd"/>
+      <w:r>
+        <w:rPr>
+          <w:rFonts w:ascii="Times New Roman" w:hAnsi="Times New Roman" w:cs="Times New Roman"/>
+          <w:lang w:val="id-ID"/>
+        </w:rPr>
+        <w:t xml:space="preserve"> Kunci untuk Bertemu dengan </w:t>
+      </w:r>
+      <w:r>
+        <w:rPr>
+          <w:rFonts w:ascii="Times New Roman" w:hAnsi="Times New Roman" w:cs="Times New Roman"/>
+          <w:i/>
+          <w:iCs/>
+          <w:lang w:val="id-ID"/>
+        </w:rPr>
+        <w:t xml:space="preserve">Guardian </w:t>
+      </w:r>
+      <w:proofErr w:type="spellStart"/>
+      <w:r>
+        <w:rPr>
+          <w:rFonts w:ascii="Times New Roman" w:hAnsi="Times New Roman" w:cs="Times New Roman"/>
+          <w:i/>
+          <w:iCs/>
+          <w:lang w:val="id-ID"/>
+        </w:rPr>
+        <w:t>of</w:t>
+      </w:r>
+      <w:proofErr w:type="spellEnd"/>
+      <w:r>
+        <w:rPr>
+          <w:rFonts w:ascii="Times New Roman" w:hAnsi="Times New Roman" w:cs="Times New Roman"/>
+          <w:i/>
+          <w:iCs/>
+          <w:lang w:val="id-ID"/>
+        </w:rPr>
+        <w:t xml:space="preserve"> </w:t>
+      </w:r>
+      <w:proofErr w:type="spellStart"/>
+      <w:r>
+        <w:rPr>
+          <w:rFonts w:ascii="Times New Roman" w:hAnsi="Times New Roman" w:cs="Times New Roman"/>
+          <w:i/>
+          <w:iCs/>
+          <w:lang w:val="id-ID"/>
+        </w:rPr>
+        <w:t>Sutasoma</w:t>
+      </w:r>
+      <w:proofErr w:type="spellEnd"/>
+      <w:r>
+        <w:rPr>
+          <w:rFonts w:ascii="Times New Roman" w:hAnsi="Times New Roman" w:cs="Times New Roman"/>
+          <w:lang w:val="id-ID"/>
+        </w:rPr>
+        <w:t>. Debat tidak akan menyerah hingga mengejar Marcel.</w:t>
+      </w:r>
+    </w:p>
+    <w:p>
+      <w:pPr>
+        <w:spacing w:line="360" w:lineRule="auto"/>
+        <w:ind w:left="720"/>
+        <w:rPr>
+          <w:rFonts w:ascii="Times New Roman" w:hAnsi="Times New Roman" w:cs="Times New Roman"/>
+          <w:lang w:val="id-ID"/>
+        </w:rPr>
+      </w:pPr>
+      <w:r>
+        <w:rPr>
+          <w:rFonts w:ascii="Times New Roman" w:hAnsi="Times New Roman" w:cs="Times New Roman"/>
+          <w:lang w:val="id-ID"/>
+        </w:rPr>
+        <w:t>Level 1 “</w:t>
+      </w:r>
+      <w:proofErr w:type="spellStart"/>
+      <w:r>
+        <w:rPr>
+          <w:rFonts w:ascii="Times New Roman" w:hAnsi="Times New Roman" w:cs="Times New Roman"/>
+          <w:lang w:val="id-ID"/>
+        </w:rPr>
+        <w:t>Debt</w:t>
+      </w:r>
+      <w:proofErr w:type="spellEnd"/>
+      <w:r>
+        <w:rPr>
+          <w:rFonts w:ascii="Times New Roman" w:hAnsi="Times New Roman" w:cs="Times New Roman"/>
+          <w:lang w:val="id-ID"/>
+        </w:rPr>
+        <w:t>” : Membuat Setiap orang yang berhutang Koin Emas dari Debat menjadi tidak Bisa Berbicara</w:t>
+      </w:r>
+    </w:p>
+    <w:p>
+      <w:pPr>
+        <w:spacing w:line="360" w:lineRule="auto"/>
+        <w:ind w:left="720"/>
+        <w:rPr>
+          <w:rFonts w:ascii="Times New Roman" w:hAnsi="Times New Roman" w:cs="Times New Roman"/>
+          <w:lang w:val="id-ID"/>
+        </w:rPr>
+      </w:pPr>
+      <w:r>
+        <w:rPr>
+          <w:rFonts w:ascii="Times New Roman" w:hAnsi="Times New Roman" w:cs="Times New Roman"/>
+          <w:lang w:val="id-ID"/>
+        </w:rPr>
+        <w:t>Level 2 “</w:t>
+      </w:r>
+      <w:proofErr w:type="spellStart"/>
+      <w:r>
+        <w:rPr>
+          <w:rFonts w:ascii="Times New Roman" w:hAnsi="Times New Roman" w:cs="Times New Roman"/>
+          <w:lang w:val="id-ID"/>
+        </w:rPr>
+        <w:t>Midnight</w:t>
+      </w:r>
+      <w:proofErr w:type="spellEnd"/>
+      <w:r>
+        <w:rPr>
+          <w:rFonts w:ascii="Times New Roman" w:hAnsi="Times New Roman" w:cs="Times New Roman"/>
+          <w:lang w:val="id-ID"/>
+        </w:rPr>
+        <w:t>” : Membuat Setiap orang yang kalah debat dengan Debat menjadi budak Debat</w:t>
+      </w:r>
+    </w:p>
+    <w:p>
+      <w:pPr>
+        <w:spacing w:line="360" w:lineRule="auto"/>
+        <w:ind w:left="720"/>
+        <w:rPr>
+          <w:rFonts w:ascii="Times New Roman" w:hAnsi="Times New Roman" w:cs="Times New Roman"/>
+          <w:lang w:val="id-ID"/>
+        </w:rPr>
+      </w:pPr>
+      <w:r>
+        <w:rPr>
+          <w:rFonts w:ascii="Times New Roman" w:hAnsi="Times New Roman" w:cs="Times New Roman"/>
+          <w:lang w:val="id-ID"/>
+        </w:rPr>
+        <w:t xml:space="preserve">Level 3 “Golden </w:t>
+      </w:r>
+      <w:proofErr w:type="spellStart"/>
+      <w:r>
+        <w:rPr>
+          <w:rFonts w:ascii="Times New Roman" w:hAnsi="Times New Roman" w:cs="Times New Roman"/>
+          <w:lang w:val="id-ID"/>
+        </w:rPr>
+        <w:t>Time</w:t>
+      </w:r>
+      <w:proofErr w:type="spellEnd"/>
+      <w:r>
+        <w:rPr>
+          <w:rFonts w:ascii="Times New Roman" w:hAnsi="Times New Roman" w:cs="Times New Roman"/>
+          <w:lang w:val="id-ID"/>
+        </w:rPr>
+        <w:t xml:space="preserve">” : Membuat Setiap orang yang gagal bayar hutang Koin Emas dari Debat, langsung meledak kepala </w:t>
+      </w:r>
+      <w:proofErr w:type="spellStart"/>
+      <w:r>
+        <w:rPr>
+          <w:rFonts w:ascii="Times New Roman" w:hAnsi="Times New Roman" w:cs="Times New Roman"/>
+          <w:lang w:val="id-ID"/>
+        </w:rPr>
+        <w:t>nya</w:t>
+      </w:r>
+      <w:proofErr w:type="spellEnd"/>
+      <w:r>
+        <w:rPr>
+          <w:rFonts w:ascii="Times New Roman" w:hAnsi="Times New Roman" w:cs="Times New Roman"/>
+          <w:lang w:val="id-ID"/>
+        </w:rPr>
+        <w:t>.</w:t>
+      </w:r>
+    </w:p>
+    <w:p>
+      <w:pPr>
+        <w:spacing w:line="360" w:lineRule="auto"/>
+        <w:ind w:left="720"/>
+        <w:rPr>
+          <w:rFonts w:ascii="Times New Roman" w:hAnsi="Times New Roman" w:cs="Times New Roman"/>
+          <w:lang w:val="id-ID"/>
+        </w:rPr>
+      </w:pPr>
+      <w:r>
+        <w:rPr>
+          <w:rFonts w:ascii="Times New Roman" w:hAnsi="Times New Roman" w:cs="Times New Roman"/>
+          <w:lang w:val="id-ID"/>
+        </w:rPr>
+        <w:t>Level 4 “Patriot” : Mengambil kecerdasan Setiap orang yang menerima makanan dari Debat, dan membuat Setiap orang tersebut menjadi idiot permanen.</w:t>
+      </w:r>
+    </w:p>
+    <w:p>
+      <w:pPr>
+        <w:spacing w:line="360" w:lineRule="auto"/>
+        <w:ind w:left="720"/>
+        <w:rPr>
+          <w:rFonts w:ascii="Times New Roman" w:hAnsi="Times New Roman" w:cs="Times New Roman"/>
+          <w:lang w:val="id-ID"/>
+        </w:rPr>
+      </w:pPr>
+      <w:r>
+        <w:rPr>
+          <w:rFonts w:ascii="Times New Roman" w:hAnsi="Times New Roman" w:cs="Times New Roman"/>
+          <w:lang w:val="id-ID"/>
+        </w:rPr>
+        <w:t>Level 5 “Air” : Mengubah Air menjadi Udara (Melenyapkan Air tanpa menguapkan Air).</w:t>
+      </w:r>
+    </w:p>
+    <w:p>
+      <w:pPr>
+        <w:spacing w:line="360" w:lineRule="auto"/>
+        <w:ind w:left="720"/>
+        <w:rPr>
+          <w:rFonts w:ascii="Times New Roman" w:hAnsi="Times New Roman" w:cs="Times New Roman"/>
+          <w:lang w:val="id-ID"/>
+        </w:rPr>
+      </w:pPr>
+      <w:r>
+        <w:rPr>
+          <w:rFonts w:ascii="Times New Roman" w:hAnsi="Times New Roman" w:cs="Times New Roman"/>
+          <w:lang w:val="id-ID"/>
+        </w:rPr>
+        <w:t>Level 6 “</w:t>
+      </w:r>
+      <w:proofErr w:type="spellStart"/>
+      <w:r>
+        <w:rPr>
+          <w:rFonts w:ascii="Times New Roman" w:hAnsi="Times New Roman" w:cs="Times New Roman"/>
+          <w:lang w:val="id-ID"/>
+        </w:rPr>
+        <w:t>Nightingale</w:t>
       </w:r>
       <w:proofErr w:type="spellEnd"/>
       <w:r>

</xml_diff>